<commit_message>
More work on the User Guide.
</commit_message>
<xml_diff>
--- a/Design & Documents/User Guide.docx
+++ b/Design & Documents/User Guide.docx
@@ -1,6 +1,6 @@
 
 <file path=word/document.xml><?xml version="1.0" encoding="utf-8"?>
-<w:document xmlns:wpc="http://schemas.microsoft.com/office/word/2010/wordprocessingCanvas" xmlns:mc="http://schemas.openxmlformats.org/markup-compatibility/2006" xmlns:o="urn:schemas-microsoft-com:office:office" xmlns:r="http://schemas.openxmlformats.org/officeDocument/2006/relationships" xmlns:m="http://schemas.openxmlformats.org/officeDocument/2006/math" xmlns:v="urn:schemas-microsoft-com:vml" xmlns:wp14="http://schemas.microsoft.com/office/word/2010/wordprocessingDrawing" xmlns:wp="http://schemas.openxmlformats.org/drawingml/2006/wordprocessingDrawing" xmlns:w10="urn:schemas-microsoft-com:office:word" xmlns:w="http://schemas.openxmlformats.org/wordprocessingml/2006/main" xmlns:w14="http://schemas.microsoft.com/office/word/2010/wordml" xmlns:w15="http://schemas.microsoft.com/office/word/2012/wordml" xmlns:wpg="http://schemas.microsoft.com/office/word/2010/wordprocessingGroup" xmlns:wpi="http://schemas.microsoft.com/office/word/2010/wordprocessingInk" xmlns:wne="http://schemas.microsoft.com/office/word/2006/wordml" xmlns:wps="http://schemas.microsoft.com/office/word/2010/wordprocessingShape" mc:Ignorable="w14 w15 wp14">
+<w:document xmlns:ve="http://schemas.openxmlformats.org/markup-compatibility/2006" xmlns:o="urn:schemas-microsoft-com:office:office" xmlns:r="http://schemas.openxmlformats.org/officeDocument/2006/relationships" xmlns:m="http://schemas.openxmlformats.org/officeDocument/2006/math" xmlns:v="urn:schemas-microsoft-com:vml" xmlns:wp="http://schemas.openxmlformats.org/drawingml/2006/wordprocessingDrawing" xmlns:w10="urn:schemas-microsoft-com:office:word" xmlns:w="http://schemas.openxmlformats.org/wordprocessingml/2006/main" xmlns:wne="http://schemas.microsoft.com/office/word/2006/wordml">
   <w:body>
     <w:sdt>
       <w:sdtPr>
@@ -25,7 +25,7 @@
           <w:tblPr>
             <w:tblW w:w="5000" w:type="pct"/>
             <w:jc w:val="center"/>
-            <w:tblLook w:val="04A0" w:firstRow="1" w:lastRow="0" w:firstColumn="1" w:lastColumn="0" w:noHBand="0" w:noVBand="1"/>
+            <w:tblLook w:val="04A0"/>
           </w:tblPr>
           <w:tblGrid>
             <w:gridCol w:w="9576"/>
@@ -49,7 +49,6 @@
                 <w:dataBinding w:prefixMappings="xmlns:ns0='http://schemas.openxmlformats.org/officeDocument/2006/extended-properties'" w:xpath="/ns0:Properties[1]/ns0:Company[1]" w:storeItemID="{6668398D-A668-4E3E-A5EB-62B293D839F1}"/>
                 <w:text/>
               </w:sdtPr>
-              <w:sdtEndPr/>
               <w:sdtContent>
                 <w:tc>
                   <w:tcPr>
@@ -96,7 +95,6 @@
                 <w:dataBinding w:prefixMappings="xmlns:ns0='http://schemas.openxmlformats.org/package/2006/metadata/core-properties' xmlns:ns1='http://purl.org/dc/elements/1.1/'" w:xpath="/ns0:coreProperties[1]/ns1:title[1]" w:storeItemID="{6C3C8BC8-F283-45AE-878A-BAB7291924A1}"/>
                 <w:text/>
               </w:sdtPr>
-              <w:sdtEndPr/>
               <w:sdtContent>
                 <w:tc>
                   <w:tcPr>
@@ -122,7 +120,25 @@
                         <w:sz w:val="80"/>
                         <w:szCs w:val="80"/>
                       </w:rPr>
-                      <w:t xml:space="preserve">Data Comm Assignment 4  </w:t>
+                      <w:t xml:space="preserve">Data </w:t>
+                    </w:r>
+                    <w:proofErr w:type="spellStart"/>
+                    <w:r>
+                      <w:rPr>
+                        <w:rFonts w:asciiTheme="majorHAnsi" w:eastAsiaTheme="majorEastAsia" w:hAnsiTheme="majorHAnsi" w:cstheme="majorBidi"/>
+                        <w:sz w:val="80"/>
+                        <w:szCs w:val="80"/>
+                      </w:rPr>
+                      <w:t>Comm</w:t>
+                    </w:r>
+                    <w:proofErr w:type="spellEnd"/>
+                    <w:r>
+                      <w:rPr>
+                        <w:rFonts w:asciiTheme="majorHAnsi" w:eastAsiaTheme="majorEastAsia" w:hAnsiTheme="majorHAnsi" w:cstheme="majorBidi"/>
+                        <w:sz w:val="80"/>
+                        <w:szCs w:val="80"/>
+                      </w:rPr>
+                      <w:t xml:space="preserve"> Assignment 4  </w:t>
                     </w:r>
                     <w:r>
                       <w:rPr>
@@ -157,7 +173,6 @@
                 <w:dataBinding w:prefixMappings="xmlns:ns0='http://schemas.openxmlformats.org/package/2006/metadata/core-properties' xmlns:ns1='http://purl.org/dc/elements/1.1/'" w:xpath="/ns0:coreProperties[1]/ns1:subject[1]" w:storeItemID="{6C3C8BC8-F283-45AE-878A-BAB7291924A1}"/>
                 <w:text/>
               </w:sdtPr>
-              <w:sdtEndPr/>
               <w:sdtContent>
                 <w:tc>
                   <w:tcPr>
@@ -224,7 +239,6 @@
                 <w:dataBinding w:prefixMappings="xmlns:ns0='http://schemas.openxmlformats.org/package/2006/metadata/core-properties' xmlns:ns1='http://purl.org/dc/elements/1.1/'" w:xpath="/ns0:coreProperties[1]/ns1:creator[1]" w:storeItemID="{6C3C8BC8-F283-45AE-878A-BAB7291924A1}"/>
                 <w:text/>
               </w:sdtPr>
-              <w:sdtEndPr/>
               <w:sdtContent>
                 <w:tc>
                   <w:tcPr>
@@ -271,12 +285,37 @@
                     <w:bCs/>
                   </w:rPr>
                 </w:pPr>
+                <w:proofErr w:type="spellStart"/>
                 <w:r>
                   <w:rPr>
                     <w:b/>
                     <w:bCs/>
                   </w:rPr>
-                  <w:t>Christofer Klassen - A00879060</w:t>
+                  <w:t>Christofer</w:t>
+                </w:r>
+                <w:proofErr w:type="spellEnd"/>
+                <w:r>
+                  <w:rPr>
+                    <w:b/>
+                    <w:bCs/>
+                  </w:rPr>
+                  <w:t xml:space="preserve"> </w:t>
+                </w:r>
+                <w:proofErr w:type="spellStart"/>
+                <w:r>
+                  <w:rPr>
+                    <w:b/>
+                    <w:bCs/>
+                  </w:rPr>
+                  <w:t>Klassen</w:t>
+                </w:r>
+                <w:proofErr w:type="spellEnd"/>
+                <w:r>
+                  <w:rPr>
+                    <w:b/>
+                    <w:bCs/>
+                  </w:rPr>
+                  <w:t xml:space="preserve"> - A00879060</w:t>
                 </w:r>
               </w:p>
             </w:tc>
@@ -305,7 +344,23 @@
                     <w:b/>
                     <w:bCs/>
                   </w:rPr>
-                  <w:t>Jeff Bayntun - A00860994</w:t>
+                  <w:t xml:space="preserve">Jeff </w:t>
+                </w:r>
+                <w:proofErr w:type="spellStart"/>
+                <w:r>
+                  <w:rPr>
+                    <w:b/>
+                    <w:bCs/>
+                  </w:rPr>
+                  <w:t>Bayntun</w:t>
+                </w:r>
+                <w:proofErr w:type="spellEnd"/>
+                <w:r>
+                  <w:rPr>
+                    <w:b/>
+                    <w:bCs/>
+                  </w:rPr>
+                  <w:t xml:space="preserve"> - A00860994</w:t>
                 </w:r>
               </w:p>
             </w:tc>
@@ -334,7 +389,23 @@
                     <w:b/>
                     <w:bCs/>
                   </w:rPr>
-                  <w:t xml:space="preserve">Thomas Tallentire - </w:t>
+                  <w:t xml:space="preserve">Thomas </w:t>
+                </w:r>
+                <w:proofErr w:type="spellStart"/>
+                <w:r>
+                  <w:rPr>
+                    <w:b/>
+                    <w:bCs/>
+                  </w:rPr>
+                  <w:t>Tallentire</w:t>
+                </w:r>
+                <w:proofErr w:type="spellEnd"/>
+                <w:r>
+                  <w:rPr>
+                    <w:b/>
+                    <w:bCs/>
+                  </w:rPr>
+                  <w:t xml:space="preserve"> - </w:t>
                 </w:r>
                 <w:r>
                   <w:rPr>
@@ -375,7 +446,7 @@
           <w:tblPr>
             <w:tblpPr w:leftFromText="187" w:rightFromText="187" w:horzAnchor="margin" w:tblpXSpec="center" w:tblpYSpec="bottom"/>
             <w:tblW w:w="5000" w:type="pct"/>
-            <w:tblLook w:val="04A0" w:firstRow="1" w:lastRow="0" w:firstColumn="1" w:lastColumn="0" w:noHBand="0" w:noVBand="1"/>
+            <w:tblLook w:val="04A0"/>
           </w:tblPr>
           <w:tblGrid>
             <w:gridCol w:w="9576"/>
@@ -465,13 +536,13 @@
           <w:r>
             <w:fldChar w:fldCharType="separate"/>
           </w:r>
-          <w:hyperlink w:anchor="_Toc403717326" w:history="1">
+          <w:hyperlink w:anchor="_Toc404021052" w:history="1">
             <w:r>
               <w:rPr>
                 <w:rStyle w:val="Hyperlink"/>
                 <w:noProof/>
               </w:rPr>
-              <w:t>Timeline</w:t>
+              <w:t>Introduction</w:t>
             </w:r>
             <w:r>
               <w:rPr>
@@ -492,7 +563,78 @@
                 <w:noProof/>
                 <w:webHidden/>
               </w:rPr>
-              <w:instrText xml:space="preserve"> PAGEREF _Toc403717326 \h </w:instrText>
+              <w:instrText xml:space="preserve"> PAGEREF _Toc404021052 \h </w:instrText>
+            </w:r>
+            <w:r>
+              <w:rPr>
+                <w:noProof/>
+                <w:webHidden/>
+              </w:rPr>
+            </w:r>
+            <w:r>
+              <w:rPr>
+                <w:noProof/>
+                <w:webHidden/>
+              </w:rPr>
+              <w:fldChar w:fldCharType="separate"/>
+            </w:r>
+            <w:r>
+              <w:rPr>
+                <w:noProof/>
+                <w:webHidden/>
+              </w:rPr>
+              <w:t>3</w:t>
+            </w:r>
+            <w:r>
+              <w:rPr>
+                <w:noProof/>
+                <w:webHidden/>
+              </w:rPr>
+              <w:fldChar w:fldCharType="end"/>
+            </w:r>
+          </w:hyperlink>
+        </w:p>
+        <w:p>
+          <w:pPr>
+            <w:pStyle w:val="TOC1"/>
+            <w:tabs>
+              <w:tab w:val="right" w:leader="dot" w:pos="9350"/>
+            </w:tabs>
+            <w:rPr>
+              <w:noProof/>
+              <w:sz w:val="22"/>
+              <w:szCs w:val="22"/>
+              <w:lang w:eastAsia="en-CA"/>
+            </w:rPr>
+          </w:pPr>
+          <w:hyperlink w:anchor="_Toc404021053" w:history="1">
+            <w:r>
+              <w:rPr>
+                <w:rStyle w:val="Hyperlink"/>
+                <w:noProof/>
+              </w:rPr>
+              <w:t>Setting Up</w:t>
+            </w:r>
+            <w:r>
+              <w:rPr>
+                <w:noProof/>
+                <w:webHidden/>
+              </w:rPr>
+              <w:tab/>
+            </w:r>
+            <w:r>
+              <w:rPr>
+                <w:noProof/>
+                <w:webHidden/>
+              </w:rPr>
+              <w:fldChar w:fldCharType="begin"/>
+            </w:r>
+            <w:r>
+              <w:rPr>
+                <w:noProof/>
+                <w:webHidden/>
+              </w:rPr>
+              <w:instrText xml:space="preserve"> PAGEREF _Toc404021053 \h </w:instrText>
             </w:r>
             <w:r>
               <w:rPr>
@@ -536,13 +678,13 @@
               <w:lang w:eastAsia="en-CA"/>
             </w:rPr>
           </w:pPr>
-          <w:hyperlink w:anchor="_Toc403717327" w:history="1">
+          <w:hyperlink w:anchor="_Toc404021054" w:history="1">
             <w:r>
               <w:rPr>
                 <w:rStyle w:val="Hyperlink"/>
                 <w:noProof/>
               </w:rPr>
-              <w:t>Week of November 17, 2014</w:t>
+              <w:t>Connecting the Modem</w:t>
             </w:r>
             <w:r>
               <w:rPr>
@@ -563,7 +705,7 @@
                 <w:noProof/>
                 <w:webHidden/>
               </w:rPr>
-              <w:instrText xml:space="preserve"> PAGEREF _Toc403717327 \h </w:instrText>
+              <w:instrText xml:space="preserve"> PAGEREF _Toc404021054 \h </w:instrText>
             </w:r>
             <w:r>
               <w:rPr>
@@ -607,13 +749,13 @@
               <w:lang w:eastAsia="en-CA"/>
             </w:rPr>
           </w:pPr>
-          <w:hyperlink w:anchor="_Toc403717328" w:history="1">
+          <w:hyperlink w:anchor="_Toc404021055" w:history="1">
             <w:r>
               <w:rPr>
                 <w:rStyle w:val="Hyperlink"/>
                 <w:noProof/>
               </w:rPr>
-              <w:t>Week of November 24, 2014</w:t>
+              <w:t>Launching the Program</w:t>
             </w:r>
             <w:r>
               <w:rPr>
@@ -634,7 +776,7 @@
                 <w:noProof/>
                 <w:webHidden/>
               </w:rPr>
-              <w:instrText xml:space="preserve"> PAGEREF _Toc403717328 \h </w:instrText>
+              <w:instrText xml:space="preserve"> PAGEREF _Toc404021055 \h </w:instrText>
             </w:r>
             <w:r>
               <w:rPr>
@@ -678,13 +820,13 @@
               <w:lang w:eastAsia="en-CA"/>
             </w:rPr>
           </w:pPr>
-          <w:hyperlink w:anchor="_Toc403717329" w:history="1">
+          <w:hyperlink w:anchor="_Toc404021056" w:history="1">
             <w:r>
               <w:rPr>
                 <w:rStyle w:val="Hyperlink"/>
                 <w:noProof/>
               </w:rPr>
-              <w:t>Work Breakdown</w:t>
+              <w:t>Features</w:t>
             </w:r>
             <w:r>
               <w:rPr>
@@ -705,7 +847,7 @@
                 <w:noProof/>
                 <w:webHidden/>
               </w:rPr>
-              <w:instrText xml:space="preserve"> PAGEREF _Toc403717329 \h </w:instrText>
+              <w:instrText xml:space="preserve"> PAGEREF _Toc404021056 \h </w:instrText>
             </w:r>
             <w:r>
               <w:rPr>
@@ -725,7 +867,7 @@
                 <w:noProof/>
                 <w:webHidden/>
               </w:rPr>
-              <w:t>4</w:t>
+              <w:t>3</w:t>
             </w:r>
             <w:r>
               <w:rPr>
@@ -749,13 +891,13 @@
               <w:lang w:eastAsia="en-CA"/>
             </w:rPr>
           </w:pPr>
-          <w:hyperlink w:anchor="_Toc403717330" w:history="1">
+          <w:hyperlink w:anchor="_Toc404021057" w:history="1">
             <w:r>
               <w:rPr>
                 <w:rStyle w:val="Hyperlink"/>
                 <w:noProof/>
               </w:rPr>
-              <w:t>Lewis Scott</w:t>
+              <w:t>Instant Messaging</w:t>
             </w:r>
             <w:r>
               <w:rPr>
@@ -776,7 +918,7 @@
                 <w:noProof/>
                 <w:webHidden/>
               </w:rPr>
-              <w:instrText xml:space="preserve"> PAGEREF _Toc403717330 \h </w:instrText>
+              <w:instrText xml:space="preserve"> PAGEREF _Toc404021057 \h </w:instrText>
             </w:r>
             <w:r>
               <w:rPr>
@@ -796,7 +938,7 @@
                 <w:noProof/>
                 <w:webHidden/>
               </w:rPr>
-              <w:t>4</w:t>
+              <w:t>3</w:t>
             </w:r>
             <w:r>
               <w:rPr>
@@ -820,13 +962,13 @@
               <w:lang w:eastAsia="en-CA"/>
             </w:rPr>
           </w:pPr>
-          <w:hyperlink w:anchor="_Toc403717331" w:history="1">
+          <w:hyperlink w:anchor="_Toc404021058" w:history="1">
             <w:r>
               <w:rPr>
                 <w:rStyle w:val="Hyperlink"/>
                 <w:noProof/>
               </w:rPr>
-              <w:t>Christofer Klassen</w:t>
+              <w:t>Sending Text Files</w:t>
             </w:r>
             <w:r>
               <w:rPr>
@@ -847,7 +989,78 @@
                 <w:noProof/>
                 <w:webHidden/>
               </w:rPr>
-              <w:instrText xml:space="preserve"> PAGEREF _Toc403717331 \h </w:instrText>
+              <w:instrText xml:space="preserve"> PAGEREF _Toc404021058 \h </w:instrText>
+            </w:r>
+            <w:r>
+              <w:rPr>
+                <w:noProof/>
+                <w:webHidden/>
+              </w:rPr>
+            </w:r>
+            <w:r>
+              <w:rPr>
+                <w:noProof/>
+                <w:webHidden/>
+              </w:rPr>
+              <w:fldChar w:fldCharType="separate"/>
+            </w:r>
+            <w:r>
+              <w:rPr>
+                <w:noProof/>
+                <w:webHidden/>
+              </w:rPr>
+              <w:t>4</w:t>
+            </w:r>
+            <w:r>
+              <w:rPr>
+                <w:noProof/>
+                <w:webHidden/>
+              </w:rPr>
+              <w:fldChar w:fldCharType="end"/>
+            </w:r>
+          </w:hyperlink>
+        </w:p>
+        <w:p>
+          <w:pPr>
+            <w:pStyle w:val="TOC1"/>
+            <w:tabs>
+              <w:tab w:val="right" w:leader="dot" w:pos="9350"/>
+            </w:tabs>
+            <w:rPr>
+              <w:noProof/>
+              <w:sz w:val="22"/>
+              <w:szCs w:val="22"/>
+              <w:lang w:eastAsia="en-CA"/>
+            </w:rPr>
+          </w:pPr>
+          <w:hyperlink w:anchor="_Toc404021059" w:history="1">
+            <w:r>
+              <w:rPr>
+                <w:rStyle w:val="Hyperlink"/>
+                <w:noProof/>
+              </w:rPr>
+              <w:t>Troubleshooting</w:t>
+            </w:r>
+            <w:r>
+              <w:rPr>
+                <w:noProof/>
+                <w:webHidden/>
+              </w:rPr>
+              <w:tab/>
+            </w:r>
+            <w:r>
+              <w:rPr>
+                <w:noProof/>
+                <w:webHidden/>
+              </w:rPr>
+              <w:fldChar w:fldCharType="begin"/>
+            </w:r>
+            <w:r>
+              <w:rPr>
+                <w:noProof/>
+                <w:webHidden/>
+              </w:rPr>
+              <w:instrText xml:space="preserve"> PAGEREF _Toc404021059 \h </w:instrText>
             </w:r>
             <w:r>
               <w:rPr>
@@ -891,13 +1104,13 @@
               <w:lang w:eastAsia="en-CA"/>
             </w:rPr>
           </w:pPr>
-          <w:hyperlink w:anchor="_Toc403717332" w:history="1">
+          <w:hyperlink w:anchor="_Toc404021060" w:history="1">
             <w:r>
               <w:rPr>
                 <w:rStyle w:val="Hyperlink"/>
                 <w:noProof/>
               </w:rPr>
-              <w:t>Jeff Bayntun</w:t>
+              <w:t>Modem cannot be found by program</w:t>
             </w:r>
             <w:r>
               <w:rPr>
@@ -918,7 +1131,75 @@
                 <w:noProof/>
                 <w:webHidden/>
               </w:rPr>
-              <w:instrText xml:space="preserve"> PAGEREF _Toc403717332 \h </w:instrText>
+              <w:instrText xml:space="preserve"> PAGEREF _Toc404021060 \h </w:instrText>
+            </w:r>
+            <w:r>
+              <w:rPr>
+                <w:noProof/>
+                <w:webHidden/>
+              </w:rPr>
+            </w:r>
+            <w:r>
+              <w:rPr>
+                <w:noProof/>
+                <w:webHidden/>
+              </w:rPr>
+              <w:fldChar w:fldCharType="separate"/>
+            </w:r>
+            <w:r>
+              <w:rPr>
+                <w:noProof/>
+                <w:webHidden/>
+              </w:rPr>
+              <w:t>4</w:t>
+            </w:r>
+            <w:r>
+              <w:rPr>
+                <w:noProof/>
+                <w:webHidden/>
+              </w:rPr>
+              <w:fldChar w:fldCharType="end"/>
+            </w:r>
+          </w:hyperlink>
+        </w:p>
+        <w:p>
+          <w:pPr>
+            <w:pStyle w:val="TOC3"/>
+            <w:tabs>
+              <w:tab w:val="right" w:leader="dot" w:pos="9350"/>
+            </w:tabs>
+            <w:rPr>
+              <w:noProof/>
+            </w:rPr>
+          </w:pPr>
+          <w:hyperlink w:anchor="_Toc404021061" w:history="1">
+            <w:r>
+              <w:rPr>
+                <w:rStyle w:val="Hyperlink"/>
+                <w:noProof/>
+              </w:rPr>
+              <w:t>Disconnect and Reconnect your Modem</w:t>
+            </w:r>
+            <w:r>
+              <w:rPr>
+                <w:noProof/>
+                <w:webHidden/>
+              </w:rPr>
+              <w:tab/>
+            </w:r>
+            <w:r>
+              <w:rPr>
+                <w:noProof/>
+                <w:webHidden/>
+              </w:rPr>
+              <w:fldChar w:fldCharType="begin"/>
+            </w:r>
+            <w:r>
+              <w:rPr>
+                <w:noProof/>
+                <w:webHidden/>
+              </w:rPr>
+              <w:instrText xml:space="preserve"> PAGEREF _Toc404021061 \h </w:instrText>
             </w:r>
             <w:r>
               <w:rPr>
@@ -962,13 +1243,13 @@
               <w:lang w:eastAsia="en-CA"/>
             </w:rPr>
           </w:pPr>
-          <w:hyperlink w:anchor="_Toc403717333" w:history="1">
+          <w:hyperlink w:anchor="_Toc404021062" w:history="1">
             <w:r>
               <w:rPr>
                 <w:rStyle w:val="Hyperlink"/>
                 <w:noProof/>
               </w:rPr>
-              <w:t>Thomas Tallentire</w:t>
+              <w:t>Jumbled characters are appearing on the screen</w:t>
             </w:r>
             <w:r>
               <w:rPr>
@@ -989,7 +1270,7 @@
                 <w:noProof/>
                 <w:webHidden/>
               </w:rPr>
-              <w:instrText xml:space="preserve"> PAGEREF _Toc403717333 \h </w:instrText>
+              <w:instrText xml:space="preserve"> PAGEREF _Toc404021062 \h </w:instrText>
             </w:r>
             <w:r>
               <w:rPr>
@@ -1009,7 +1290,75 @@
                 <w:noProof/>
                 <w:webHidden/>
               </w:rPr>
-              <w:t>5</w:t>
+              <w:t>4</w:t>
+            </w:r>
+            <w:r>
+              <w:rPr>
+                <w:noProof/>
+                <w:webHidden/>
+              </w:rPr>
+              <w:fldChar w:fldCharType="end"/>
+            </w:r>
+          </w:hyperlink>
+        </w:p>
+        <w:p>
+          <w:pPr>
+            <w:pStyle w:val="TOC3"/>
+            <w:tabs>
+              <w:tab w:val="right" w:leader="dot" w:pos="9350"/>
+            </w:tabs>
+            <w:rPr>
+              <w:noProof/>
+            </w:rPr>
+          </w:pPr>
+          <w:hyperlink w:anchor="_Toc404021063" w:history="1">
+            <w:r>
+              <w:rPr>
+                <w:rStyle w:val="Hyperlink"/>
+                <w:noProof/>
+              </w:rPr>
+              <w:t>Relocate to a Different Area</w:t>
+            </w:r>
+            <w:r>
+              <w:rPr>
+                <w:noProof/>
+                <w:webHidden/>
+              </w:rPr>
+              <w:tab/>
+            </w:r>
+            <w:r>
+              <w:rPr>
+                <w:noProof/>
+                <w:webHidden/>
+              </w:rPr>
+              <w:fldChar w:fldCharType="begin"/>
+            </w:r>
+            <w:r>
+              <w:rPr>
+                <w:noProof/>
+                <w:webHidden/>
+              </w:rPr>
+              <w:instrText xml:space="preserve"> PAGEREF _Toc404021063 \h </w:instrText>
+            </w:r>
+            <w:r>
+              <w:rPr>
+                <w:noProof/>
+                <w:webHidden/>
+              </w:rPr>
+            </w:r>
+            <w:r>
+              <w:rPr>
+                <w:noProof/>
+                <w:webHidden/>
+              </w:rPr>
+              <w:fldChar w:fldCharType="separate"/>
+            </w:r>
+            <w:r>
+              <w:rPr>
+                <w:noProof/>
+                <w:webHidden/>
+              </w:rPr>
+              <w:t>4</w:t>
             </w:r>
             <w:r>
               <w:rPr>
@@ -1056,29 +1405,53 @@
         <w:pStyle w:val="Heading1"/>
         <w:jc w:val="center"/>
       </w:pPr>
+      <w:bookmarkStart w:id="0" w:name="_Toc404021052"/>
       <w:r>
         <w:lastRenderedPageBreak/>
         <w:t>Introduction</w:t>
       </w:r>
+      <w:bookmarkEnd w:id="0"/>
     </w:p>
     <w:p/>
     <w:p>
-      <w:pPr>
-        <w:pStyle w:val="Heading1"/>
-        <w:jc w:val="center"/>
-      </w:pPr>
       <w:r>
-        <w:t>Setting Up</w:t>
+        <w:t>This program is a communications protocol designed to implement and display the functionality of the Grapefruit Protocol for one-to-one wired and wireless communication.</w:t>
       </w:r>
     </w:p>
     <w:p/>
     <w:p>
+      <w:r>
+        <w:t>This program contains functionality for</w:t>
+      </w:r>
+      <w:r>
+        <w:t xml:space="preserve"> transmitting single characters and full text files across wired and wireless environments, and is capable of tracking protocol statistics for debugging and analytical purposes.</w:t>
+      </w:r>
+      <w:r>
+        <w:t xml:space="preserve"> </w:t>
+      </w:r>
+    </w:p>
+    <w:p/>
+    <w:p>
+      <w:pPr>
+        <w:pStyle w:val="Heading1"/>
+        <w:jc w:val="center"/>
+      </w:pPr>
+      <w:bookmarkStart w:id="1" w:name="_Toc404021053"/>
+      <w:r>
+        <w:t>Setting Up</w:t>
+      </w:r>
+      <w:bookmarkEnd w:id="1"/>
+    </w:p>
+    <w:p/>
+    <w:p>
       <w:pPr>
         <w:pStyle w:val="Heading2"/>
       </w:pPr>
+      <w:bookmarkStart w:id="2" w:name="_Toc404021054"/>
       <w:r>
         <w:t>Connecting the Modem</w:t>
       </w:r>
+      <w:bookmarkEnd w:id="2"/>
     </w:p>
     <w:p/>
     <w:p>
@@ -1142,17 +1515,19 @@
       <w:pPr>
         <w:pStyle w:val="Heading2"/>
       </w:pPr>
+      <w:bookmarkStart w:id="3" w:name="_Toc404021055"/>
       <w:r>
         <w:t>Launching the Program</w:t>
       </w:r>
+      <w:bookmarkEnd w:id="3"/>
     </w:p>
     <w:p/>
     <w:p>
       <w:r>
         <w:t>In order to run the program, you must first ensure that your modem has been connected. Once this has been completed, all you need to do is double-click the executable file in the project folder. The program should start immediately.</w:t>
       </w:r>
-      <w:bookmarkStart w:id="0" w:name="_GoBack"/>
-      <w:bookmarkEnd w:id="0"/>
+      <w:bookmarkStart w:id="4" w:name="_GoBack"/>
+      <w:bookmarkEnd w:id="4"/>
     </w:p>
     <w:p/>
     <w:p>
@@ -1160,39 +1535,33 @@
         <w:pStyle w:val="Heading1"/>
         <w:jc w:val="center"/>
       </w:pPr>
+      <w:bookmarkStart w:id="5" w:name="_Toc404021056"/>
       <w:r>
         <w:t>Features</w:t>
+      </w:r>
+      <w:bookmarkEnd w:id="5"/>
+    </w:p>
+    <w:p/>
+    <w:p>
+      <w:pPr>
+        <w:pStyle w:val="Heading2"/>
+      </w:pPr>
+      <w:bookmarkStart w:id="6" w:name="_Toc404021057"/>
+      <w:r>
+        <w:t>Instant Messaging</w:t>
+      </w:r>
+      <w:bookmarkEnd w:id="6"/>
+    </w:p>
+    <w:p/>
+    <w:p>
+      <w:r>
+        <w:t>This program allows you to send messages character-by-character as you type. In order to access this functionality, run your program and start typing to the keyboard. Your text will be sent to the receiving user as you are typing.</w:t>
       </w:r>
     </w:p>
     <w:p/>
     <w:p>
-      <w:pPr>
-        <w:pStyle w:val="Heading2"/>
-      </w:pPr>
       <w:r>
-        <w:t>Instant Messaging</w:t>
-      </w:r>
-    </w:p>
-    <w:p/>
-    <w:p/>
-    <w:p/>
-    <w:p>
-      <w:pPr>
-        <w:pStyle w:val="Heading2"/>
-      </w:pPr>
-      <w:r>
-        <w:t>Sending Text Files</w:t>
-      </w:r>
-    </w:p>
-    <w:p/>
-    <w:p/>
-    <w:p>
-      <w:pPr>
-        <w:pStyle w:val="Heading1"/>
-        <w:jc w:val="center"/>
-      </w:pPr>
-      <w:r>
-        <w:t>Troubleshooting</w:t>
+        <w:t>In addition, you will receive text character-by-character from the connected user as they are typing. This text will display on your screen as it arrives.</w:t>
       </w:r>
     </w:p>
     <w:p/>
@@ -1200,10 +1569,52 @@
       <w:pPr>
         <w:pStyle w:val="Heading2"/>
       </w:pPr>
+      <w:bookmarkStart w:id="7" w:name="_Toc404021058"/>
       <w:r>
-        <w:lastRenderedPageBreak/>
+        <w:t>Sending Text Files</w:t>
+      </w:r>
+      <w:bookmarkEnd w:id="7"/>
+    </w:p>
+    <w:p/>
+    <w:p>
+      <w:r>
+        <w:t xml:space="preserve">This program also allows you to send messages via text files. To access this functionality, select "Send" from the menu bar and click on "Send text file". You will be prompted </w:t>
+      </w:r>
+      <w:r>
+        <w:t>to select a file from your computer. Once selected, the text file will be transferred to the user.</w:t>
+      </w:r>
+      <w:r>
+        <w:t xml:space="preserve"> Characters typed during this time will be appended to the end of the message after it has completed its transfer.</w:t>
+      </w:r>
+    </w:p>
+    <w:p/>
+    <w:p>
+      <w:r>
+        <w:t xml:space="preserve">In the event that you receive a text file from your connected user, the text will be displayed to your screen in bulk, as it arrives. </w:t>
+      </w:r>
+    </w:p>
+    <w:p/>
+    <w:p>
+      <w:pPr>
+        <w:pStyle w:val="Heading1"/>
+        <w:jc w:val="center"/>
+      </w:pPr>
+      <w:bookmarkStart w:id="8" w:name="_Toc404021059"/>
+      <w:r>
+        <w:t>Troubleshooting</w:t>
+      </w:r>
+      <w:bookmarkEnd w:id="8"/>
+    </w:p>
+    <w:p/>
+    <w:p>
+      <w:pPr>
+        <w:pStyle w:val="Heading2"/>
+      </w:pPr>
+      <w:bookmarkStart w:id="9" w:name="_Toc404021060"/>
+      <w:r>
         <w:t>Modem cannot be found by program</w:t>
       </w:r>
+      <w:bookmarkEnd w:id="9"/>
     </w:p>
     <w:p/>
     <w:p>
@@ -1216,14 +1627,50 @@
       <w:pPr>
         <w:pStyle w:val="Heading3"/>
       </w:pPr>
+      <w:bookmarkStart w:id="10" w:name="_Toc404021061"/>
       <w:r>
         <w:t>Disconnect and Reconnect your Modem</w:t>
       </w:r>
+      <w:bookmarkEnd w:id="10"/>
     </w:p>
     <w:p/>
     <w:p>
       <w:r>
         <w:t>It is possible that your modem was not connected properly, or that the connection has become loose since you initially connected it. Try disconnecting it completely and then re-connecting it, ensuring that the screws on either side are also connected.</w:t>
+      </w:r>
+    </w:p>
+    <w:p/>
+    <w:p>
+      <w:pPr>
+        <w:pStyle w:val="Heading2"/>
+      </w:pPr>
+      <w:bookmarkStart w:id="11" w:name="_Toc404021062"/>
+      <w:r>
+        <w:t>Jumbled characters are appearing on the screen</w:t>
+      </w:r>
+      <w:bookmarkEnd w:id="11"/>
+    </w:p>
+    <w:p/>
+    <w:p>
+      <w:r>
+        <w:t>If you are receiving strange, unpredicted characters, try the following solutions:</w:t>
+      </w:r>
+    </w:p>
+    <w:p/>
+    <w:p>
+      <w:pPr>
+        <w:pStyle w:val="Heading3"/>
+      </w:pPr>
+      <w:bookmarkStart w:id="12" w:name="_Toc404021063"/>
+      <w:r>
+        <w:t>Relocate to a Different Area</w:t>
+      </w:r>
+      <w:bookmarkEnd w:id="12"/>
+    </w:p>
+    <w:p/>
+    <w:p>
+      <w:r>
+        <w:t>It's possible that your modem is receiving additional signals from other transmitting devices nearby. These additional devices are not designed to work with this program, and as a result will deliver bad data to your modem, or will alter the data being sent by the connected user.</w:t>
       </w:r>
     </w:p>
     <w:p/>
@@ -1244,7 +1691,7 @@
 </file>
 
 <file path=word/numbering.xml><?xml version="1.0" encoding="utf-8"?>
-<w:numbering xmlns:wpc="http://schemas.microsoft.com/office/word/2010/wordprocessingCanvas" xmlns:mc="http://schemas.openxmlformats.org/markup-compatibility/2006" xmlns:o="urn:schemas-microsoft-com:office:office" xmlns:r="http://schemas.openxmlformats.org/officeDocument/2006/relationships" xmlns:m="http://schemas.openxmlformats.org/officeDocument/2006/math" xmlns:v="urn:schemas-microsoft-com:vml" xmlns:wp14="http://schemas.microsoft.com/office/word/2010/wordprocessingDrawing" xmlns:wp="http://schemas.openxmlformats.org/drawingml/2006/wordprocessingDrawing" xmlns:w10="urn:schemas-microsoft-com:office:word" xmlns:w="http://schemas.openxmlformats.org/wordprocessingml/2006/main" xmlns:w14="http://schemas.microsoft.com/office/word/2010/wordml" xmlns:w15="http://schemas.microsoft.com/office/word/2012/wordml" xmlns:wpg="http://schemas.microsoft.com/office/word/2010/wordprocessingGroup" xmlns:wpi="http://schemas.microsoft.com/office/word/2010/wordprocessingInk" xmlns:wne="http://schemas.microsoft.com/office/word/2006/wordml" xmlns:wps="http://schemas.microsoft.com/office/word/2010/wordprocessingShape" mc:Ignorable="w14 w15 wp14">
+<w:numbering xmlns:ve="http://schemas.openxmlformats.org/markup-compatibility/2006" xmlns:o="urn:schemas-microsoft-com:office:office" xmlns:r="http://schemas.openxmlformats.org/officeDocument/2006/relationships" xmlns:m="http://schemas.openxmlformats.org/officeDocument/2006/math" xmlns:v="urn:schemas-microsoft-com:vml" xmlns:wp="http://schemas.openxmlformats.org/drawingml/2006/wordprocessingDrawing" xmlns:w10="urn:schemas-microsoft-com:office:word" xmlns:w="http://schemas.openxmlformats.org/wordprocessingml/2006/main" xmlns:wne="http://schemas.microsoft.com/office/word/2006/wordml">
   <w:abstractNum w:abstractNumId="0">
     <w:nsid w:val="09FC30B9"/>
     <w:multiLevelType w:val="hybridMultilevel"/>
@@ -2477,7 +2924,7 @@
 </file>
 
 <file path=word/styles.xml><?xml version="1.0" encoding="utf-8"?>
-<w:styles xmlns:mc="http://schemas.openxmlformats.org/markup-compatibility/2006" xmlns:r="http://schemas.openxmlformats.org/officeDocument/2006/relationships" xmlns:w="http://schemas.openxmlformats.org/wordprocessingml/2006/main" xmlns:w14="http://schemas.microsoft.com/office/word/2010/wordml" xmlns:w15="http://schemas.microsoft.com/office/word/2012/wordml" mc:Ignorable="w14 w15">
+<w:styles xmlns:r="http://schemas.openxmlformats.org/officeDocument/2006/relationships" xmlns:w="http://schemas.openxmlformats.org/wordprocessingml/2006/main">
   <w:docDefaults>
     <w:rPrDefault>
       <w:rPr>
@@ -2493,378 +2940,144 @@
       </w:pPr>
     </w:pPrDefault>
   </w:docDefaults>
-  <w:latentStyles w:defLockedState="0" w:defUIPriority="99" w:defSemiHidden="0" w:defUnhideWhenUsed="0" w:defQFormat="0" w:count="371">
-    <w:lsdException w:name="Normal" w:uiPriority="0" w:qFormat="1"/>
-    <w:lsdException w:name="heading 1" w:uiPriority="9" w:qFormat="1"/>
-    <w:lsdException w:name="heading 2" w:semiHidden="1" w:uiPriority="9" w:unhideWhenUsed="1" w:qFormat="1"/>
-    <w:lsdException w:name="heading 3" w:semiHidden="1" w:uiPriority="9" w:unhideWhenUsed="1" w:qFormat="1"/>
-    <w:lsdException w:name="heading 4" w:semiHidden="1" w:uiPriority="9" w:unhideWhenUsed="1" w:qFormat="1"/>
-    <w:lsdException w:name="heading 5" w:semiHidden="1" w:uiPriority="9" w:unhideWhenUsed="1" w:qFormat="1"/>
-    <w:lsdException w:name="heading 6" w:semiHidden="1" w:uiPriority="9" w:unhideWhenUsed="1" w:qFormat="1"/>
-    <w:lsdException w:name="heading 7" w:semiHidden="1" w:uiPriority="9" w:unhideWhenUsed="1" w:qFormat="1"/>
-    <w:lsdException w:name="heading 8" w:semiHidden="1" w:uiPriority="9" w:unhideWhenUsed="1" w:qFormat="1"/>
-    <w:lsdException w:name="heading 9" w:semiHidden="1" w:uiPriority="9" w:unhideWhenUsed="1" w:qFormat="1"/>
-    <w:lsdException w:name="index 1" w:semiHidden="1" w:unhideWhenUsed="1"/>
-    <w:lsdException w:name="index 2" w:semiHidden="1" w:unhideWhenUsed="1"/>
-    <w:lsdException w:name="index 3" w:semiHidden="1" w:unhideWhenUsed="1"/>
-    <w:lsdException w:name="index 4" w:semiHidden="1" w:unhideWhenUsed="1"/>
-    <w:lsdException w:name="index 5" w:semiHidden="1" w:unhideWhenUsed="1"/>
-    <w:lsdException w:name="index 6" w:semiHidden="1" w:unhideWhenUsed="1"/>
-    <w:lsdException w:name="index 7" w:semiHidden="1" w:unhideWhenUsed="1"/>
-    <w:lsdException w:name="index 8" w:semiHidden="1" w:unhideWhenUsed="1"/>
-    <w:lsdException w:name="index 9" w:semiHidden="1" w:unhideWhenUsed="1"/>
-    <w:lsdException w:name="toc 1" w:semiHidden="1" w:uiPriority="39" w:unhideWhenUsed="1"/>
-    <w:lsdException w:name="toc 2" w:semiHidden="1" w:uiPriority="39" w:unhideWhenUsed="1"/>
-    <w:lsdException w:name="toc 3" w:semiHidden="1" w:uiPriority="39" w:unhideWhenUsed="1"/>
-    <w:lsdException w:name="toc 4" w:semiHidden="1" w:uiPriority="39" w:unhideWhenUsed="1"/>
-    <w:lsdException w:name="toc 5" w:semiHidden="1" w:uiPriority="39" w:unhideWhenUsed="1"/>
-    <w:lsdException w:name="toc 6" w:semiHidden="1" w:uiPriority="39" w:unhideWhenUsed="1"/>
-    <w:lsdException w:name="toc 7" w:semiHidden="1" w:uiPriority="39" w:unhideWhenUsed="1"/>
-    <w:lsdException w:name="toc 8" w:semiHidden="1" w:uiPriority="39" w:unhideWhenUsed="1"/>
-    <w:lsdException w:name="toc 9" w:semiHidden="1" w:uiPriority="39" w:unhideWhenUsed="1"/>
-    <w:lsdException w:name="Normal Indent" w:semiHidden="1" w:unhideWhenUsed="1"/>
-    <w:lsdException w:name="footnote text" w:semiHidden="1" w:unhideWhenUsed="1"/>
-    <w:lsdException w:name="annotation text" w:semiHidden="1" w:unhideWhenUsed="1"/>
-    <w:lsdException w:name="header" w:semiHidden="1" w:unhideWhenUsed="1"/>
-    <w:lsdException w:name="footer" w:semiHidden="1" w:unhideWhenUsed="1"/>
-    <w:lsdException w:name="index heading" w:semiHidden="1" w:unhideWhenUsed="1"/>
-    <w:lsdException w:name="caption" w:semiHidden="1" w:uiPriority="35" w:unhideWhenUsed="1" w:qFormat="1"/>
-    <w:lsdException w:name="table of figures" w:semiHidden="1" w:unhideWhenUsed="1"/>
-    <w:lsdException w:name="envelope address" w:semiHidden="1" w:unhideWhenUsed="1"/>
-    <w:lsdException w:name="envelope return" w:semiHidden="1" w:unhideWhenUsed="1"/>
-    <w:lsdException w:name="footnote reference" w:semiHidden="1" w:unhideWhenUsed="1"/>
-    <w:lsdException w:name="annotation reference" w:semiHidden="1" w:unhideWhenUsed="1"/>
-    <w:lsdException w:name="line number" w:semiHidden="1" w:unhideWhenUsed="1"/>
-    <w:lsdException w:name="page number" w:semiHidden="1" w:unhideWhenUsed="1"/>
-    <w:lsdException w:name="endnote reference" w:semiHidden="1" w:unhideWhenUsed="1"/>
-    <w:lsdException w:name="endnote text" w:semiHidden="1" w:unhideWhenUsed="1"/>
-    <w:lsdException w:name="table of authorities" w:semiHidden="1" w:unhideWhenUsed="1"/>
-    <w:lsdException w:name="macro" w:semiHidden="1" w:unhideWhenUsed="1"/>
-    <w:lsdException w:name="toa heading" w:semiHidden="1" w:unhideWhenUsed="1"/>
-    <w:lsdException w:name="List" w:semiHidden="1" w:unhideWhenUsed="1"/>
-    <w:lsdException w:name="List Bullet" w:semiHidden="1" w:unhideWhenUsed="1"/>
-    <w:lsdException w:name="List Number" w:semiHidden="1" w:unhideWhenUsed="1"/>
-    <w:lsdException w:name="List 2" w:semiHidden="1" w:unhideWhenUsed="1"/>
-    <w:lsdException w:name="List 3" w:semiHidden="1" w:unhideWhenUsed="1"/>
-    <w:lsdException w:name="List 4" w:semiHidden="1" w:unhideWhenUsed="1"/>
-    <w:lsdException w:name="List 5" w:semiHidden="1" w:unhideWhenUsed="1"/>
-    <w:lsdException w:name="List Bullet 2" w:semiHidden="1" w:unhideWhenUsed="1"/>
-    <w:lsdException w:name="List Bullet 3" w:semiHidden="1" w:unhideWhenUsed="1"/>
-    <w:lsdException w:name="List Bullet 4" w:semiHidden="1" w:unhideWhenUsed="1"/>
-    <w:lsdException w:name="List Bullet 5" w:semiHidden="1" w:unhideWhenUsed="1"/>
-    <w:lsdException w:name="List Number 2" w:semiHidden="1" w:unhideWhenUsed="1"/>
-    <w:lsdException w:name="List Number 3" w:semiHidden="1" w:unhideWhenUsed="1"/>
-    <w:lsdException w:name="List Number 4" w:semiHidden="1" w:unhideWhenUsed="1"/>
-    <w:lsdException w:name="List Number 5" w:semiHidden="1" w:unhideWhenUsed="1"/>
-    <w:lsdException w:name="Title" w:uiPriority="10" w:qFormat="1"/>
-    <w:lsdException w:name="Closing" w:semiHidden="1" w:unhideWhenUsed="1"/>
-    <w:lsdException w:name="Signature" w:semiHidden="1" w:unhideWhenUsed="1"/>
-    <w:lsdException w:name="Default Paragraph Font" w:semiHidden="1" w:uiPriority="1" w:unhideWhenUsed="1"/>
-    <w:lsdException w:name="Body Text" w:semiHidden="1" w:unhideWhenUsed="1"/>
-    <w:lsdException w:name="Body Text Indent" w:semiHidden="1" w:unhideWhenUsed="1"/>
-    <w:lsdException w:name="List Continue" w:semiHidden="1" w:unhideWhenUsed="1"/>
-    <w:lsdException w:name="List Continue 2" w:semiHidden="1" w:unhideWhenUsed="1"/>
-    <w:lsdException w:name="List Continue 3" w:semiHidden="1" w:unhideWhenUsed="1"/>
-    <w:lsdException w:name="List Continue 4" w:semiHidden="1" w:unhideWhenUsed="1"/>
-    <w:lsdException w:name="List Continue 5" w:semiHidden="1" w:unhideWhenUsed="1"/>
-    <w:lsdException w:name="Message Header" w:semiHidden="1" w:unhideWhenUsed="1"/>
-    <w:lsdException w:name="Subtitle" w:uiPriority="11" w:qFormat="1"/>
-    <w:lsdException w:name="Salutation" w:semiHidden="1" w:unhideWhenUsed="1"/>
-    <w:lsdException w:name="Date" w:semiHidden="1" w:unhideWhenUsed="1"/>
-    <w:lsdException w:name="Body Text First Indent" w:semiHidden="1" w:unhideWhenUsed="1"/>
-    <w:lsdException w:name="Body Text First Indent 2" w:semiHidden="1" w:unhideWhenUsed="1"/>
-    <w:lsdException w:name="Note Heading" w:semiHidden="1" w:unhideWhenUsed="1"/>
-    <w:lsdException w:name="Body Text 2" w:semiHidden="1" w:unhideWhenUsed="1"/>
-    <w:lsdException w:name="Body Text 3" w:semiHidden="1" w:unhideWhenUsed="1"/>
-    <w:lsdException w:name="Body Text Indent 2" w:semiHidden="1" w:unhideWhenUsed="1"/>
-    <w:lsdException w:name="Body Text Indent 3" w:semiHidden="1" w:unhideWhenUsed="1"/>
-    <w:lsdException w:name="Block Text" w:semiHidden="1" w:unhideWhenUsed="1"/>
-    <w:lsdException w:name="Hyperlink" w:semiHidden="1" w:unhideWhenUsed="1"/>
-    <w:lsdException w:name="FollowedHyperlink" w:semiHidden="1" w:unhideWhenUsed="1"/>
-    <w:lsdException w:name="Strong" w:uiPriority="22" w:qFormat="1"/>
-    <w:lsdException w:name="Emphasis" w:uiPriority="20" w:qFormat="1"/>
-    <w:lsdException w:name="Document Map" w:semiHidden="1" w:unhideWhenUsed="1"/>
-    <w:lsdException w:name="Plain Text" w:semiHidden="1" w:unhideWhenUsed="1"/>
-    <w:lsdException w:name="E-mail Signature" w:semiHidden="1" w:unhideWhenUsed="1"/>
-    <w:lsdException w:name="HTML Top of Form" w:semiHidden="1" w:unhideWhenUsed="1"/>
-    <w:lsdException w:name="HTML Bottom of Form" w:semiHidden="1" w:unhideWhenUsed="1"/>
-    <w:lsdException w:name="Normal (Web)" w:semiHidden="1" w:unhideWhenUsed="1"/>
-    <w:lsdException w:name="HTML Acronym" w:semiHidden="1" w:unhideWhenUsed="1"/>
-    <w:lsdException w:name="HTML Address" w:semiHidden="1" w:unhideWhenUsed="1"/>
-    <w:lsdException w:name="HTML Cite" w:semiHidden="1" w:unhideWhenUsed="1"/>
-    <w:lsdException w:name="HTML Code" w:semiHidden="1" w:unhideWhenUsed="1"/>
-    <w:lsdException w:name="HTML Definition" w:semiHidden="1" w:unhideWhenUsed="1"/>
-    <w:lsdException w:name="HTML Keyboard" w:semiHidden="1" w:unhideWhenUsed="1"/>
-    <w:lsdException w:name="HTML Preformatted" w:semiHidden="1" w:unhideWhenUsed="1"/>
-    <w:lsdException w:name="HTML Sample" w:semiHidden="1" w:unhideWhenUsed="1"/>
-    <w:lsdException w:name="HTML Typewriter" w:semiHidden="1" w:unhideWhenUsed="1"/>
-    <w:lsdException w:name="HTML Variable" w:semiHidden="1" w:unhideWhenUsed="1"/>
-    <w:lsdException w:name="Normal Table" w:semiHidden="1" w:unhideWhenUsed="1"/>
-    <w:lsdException w:name="annotation subject" w:semiHidden="1" w:unhideWhenUsed="1"/>
-    <w:lsdException w:name="No List" w:semiHidden="1" w:unhideWhenUsed="1"/>
-    <w:lsdException w:name="Outline List 1" w:semiHidden="1" w:unhideWhenUsed="1"/>
-    <w:lsdException w:name="Outline List 2" w:semiHidden="1" w:unhideWhenUsed="1"/>
-    <w:lsdException w:name="Outline List 3" w:semiHidden="1" w:unhideWhenUsed="1"/>
-    <w:lsdException w:name="Table Simple 1" w:semiHidden="1" w:unhideWhenUsed="1"/>
-    <w:lsdException w:name="Table Simple 2" w:semiHidden="1" w:unhideWhenUsed="1"/>
-    <w:lsdException w:name="Table Simple 3" w:semiHidden="1" w:unhideWhenUsed="1"/>
-    <w:lsdException w:name="Table Classic 1" w:semiHidden="1" w:unhideWhenUsed="1"/>
-    <w:lsdException w:name="Table Classic 2" w:semiHidden="1" w:unhideWhenUsed="1"/>
-    <w:lsdException w:name="Table Classic 3" w:semiHidden="1" w:unhideWhenUsed="1"/>
-    <w:lsdException w:name="Table Classic 4" w:semiHidden="1" w:unhideWhenUsed="1"/>
-    <w:lsdException w:name="Table Colorful 1" w:semiHidden="1" w:unhideWhenUsed="1"/>
-    <w:lsdException w:name="Table Colorful 2" w:semiHidden="1" w:unhideWhenUsed="1"/>
-    <w:lsdException w:name="Table Colorful 3" w:semiHidden="1" w:unhideWhenUsed="1"/>
-    <w:lsdException w:name="Table Columns 1" w:semiHidden="1" w:unhideWhenUsed="1"/>
-    <w:lsdException w:name="Table Columns 2" w:semiHidden="1" w:unhideWhenUsed="1"/>
-    <w:lsdException w:name="Table Columns 3" w:semiHidden="1" w:unhideWhenUsed="1"/>
-    <w:lsdException w:name="Table Columns 4" w:semiHidden="1" w:unhideWhenUsed="1"/>
-    <w:lsdException w:name="Table Columns 5" w:semiHidden="1" w:unhideWhenUsed="1"/>
-    <w:lsdException w:name="Table Grid 1" w:semiHidden="1" w:unhideWhenUsed="1"/>
-    <w:lsdException w:name="Table Grid 2" w:semiHidden="1" w:unhideWhenUsed="1"/>
-    <w:lsdException w:name="Table Grid 3" w:semiHidden="1" w:unhideWhenUsed="1"/>
-    <w:lsdException w:name="Table Grid 4" w:semiHidden="1" w:unhideWhenUsed="1"/>
-    <w:lsdException w:name="Table Grid 5" w:semiHidden="1" w:unhideWhenUsed="1"/>
-    <w:lsdException w:name="Table Grid 6" w:semiHidden="1" w:unhideWhenUsed="1"/>
-    <w:lsdException w:name="Table Grid 7" w:semiHidden="1" w:unhideWhenUsed="1"/>
-    <w:lsdException w:name="Table Grid 8" w:semiHidden="1" w:unhideWhenUsed="1"/>
-    <w:lsdException w:name="Table List 1" w:semiHidden="1" w:unhideWhenUsed="1"/>
-    <w:lsdException w:name="Table List 2" w:semiHidden="1" w:unhideWhenUsed="1"/>
-    <w:lsdException w:name="Table List 3" w:semiHidden="1" w:unhideWhenUsed="1"/>
-    <w:lsdException w:name="Table List 4" w:semiHidden="1" w:unhideWhenUsed="1"/>
-    <w:lsdException w:name="Table List 5" w:semiHidden="1" w:unhideWhenUsed="1"/>
-    <w:lsdException w:name="Table List 6" w:semiHidden="1" w:unhideWhenUsed="1"/>
-    <w:lsdException w:name="Table List 7" w:semiHidden="1" w:unhideWhenUsed="1"/>
-    <w:lsdException w:name="Table List 8" w:semiHidden="1" w:unhideWhenUsed="1"/>
-    <w:lsdException w:name="Table 3D effects 1" w:semiHidden="1" w:unhideWhenUsed="1"/>
-    <w:lsdException w:name="Table 3D effects 2" w:semiHidden="1" w:unhideWhenUsed="1"/>
-    <w:lsdException w:name="Table 3D effects 3" w:semiHidden="1" w:unhideWhenUsed="1"/>
-    <w:lsdException w:name="Table Contemporary" w:semiHidden="1" w:unhideWhenUsed="1"/>
-    <w:lsdException w:name="Table Elegant" w:semiHidden="1" w:unhideWhenUsed="1"/>
-    <w:lsdException w:name="Table Professional" w:semiHidden="1" w:unhideWhenUsed="1"/>
-    <w:lsdException w:name="Table Subtle 1" w:semiHidden="1" w:unhideWhenUsed="1"/>
-    <w:lsdException w:name="Table Subtle 2" w:semiHidden="1" w:unhideWhenUsed="1"/>
-    <w:lsdException w:name="Table Web 1" w:semiHidden="1" w:unhideWhenUsed="1"/>
-    <w:lsdException w:name="Table Web 2" w:semiHidden="1" w:unhideWhenUsed="1"/>
-    <w:lsdException w:name="Table Web 3" w:semiHidden="1" w:unhideWhenUsed="1"/>
-    <w:lsdException w:name="Balloon Text" w:semiHidden="1" w:unhideWhenUsed="1"/>
-    <w:lsdException w:name="Table Grid" w:uiPriority="39"/>
-    <w:lsdException w:name="Table Theme" w:semiHidden="1" w:unhideWhenUsed="1"/>
-    <w:lsdException w:name="Placeholder Text" w:semiHidden="1"/>
-    <w:lsdException w:name="No Spacing" w:uiPriority="1" w:qFormat="1"/>
-    <w:lsdException w:name="Light Shading" w:uiPriority="60"/>
-    <w:lsdException w:name="Light List" w:uiPriority="61"/>
-    <w:lsdException w:name="Light Grid" w:uiPriority="62"/>
-    <w:lsdException w:name="Medium Shading 1" w:uiPriority="63"/>
-    <w:lsdException w:name="Medium Shading 2" w:uiPriority="64"/>
-    <w:lsdException w:name="Medium List 1" w:uiPriority="65"/>
-    <w:lsdException w:name="Medium List 2" w:uiPriority="66"/>
-    <w:lsdException w:name="Medium Grid 1" w:uiPriority="67"/>
-    <w:lsdException w:name="Medium Grid 2" w:uiPriority="68"/>
-    <w:lsdException w:name="Medium Grid 3" w:uiPriority="69"/>
-    <w:lsdException w:name="Dark List" w:uiPriority="70"/>
-    <w:lsdException w:name="Colorful Shading" w:uiPriority="71"/>
-    <w:lsdException w:name="Colorful List" w:uiPriority="72"/>
-    <w:lsdException w:name="Colorful Grid" w:uiPriority="73"/>
-    <w:lsdException w:name="Light Shading Accent 1" w:uiPriority="60"/>
-    <w:lsdException w:name="Light List Accent 1" w:uiPriority="61"/>
-    <w:lsdException w:name="Light Grid Accent 1" w:uiPriority="62"/>
-    <w:lsdException w:name="Medium Shading 1 Accent 1" w:uiPriority="63"/>
-    <w:lsdException w:name="Medium Shading 2 Accent 1" w:uiPriority="64"/>
-    <w:lsdException w:name="Medium List 1 Accent 1" w:uiPriority="65"/>
-    <w:lsdException w:name="Revision" w:semiHidden="1"/>
-    <w:lsdException w:name="List Paragraph" w:uiPriority="34" w:qFormat="1"/>
-    <w:lsdException w:name="Quote" w:uiPriority="29" w:qFormat="1"/>
-    <w:lsdException w:name="Intense Quote" w:uiPriority="30" w:qFormat="1"/>
-    <w:lsdException w:name="Medium List 2 Accent 1" w:uiPriority="66"/>
-    <w:lsdException w:name="Medium Grid 1 Accent 1" w:uiPriority="67"/>
-    <w:lsdException w:name="Medium Grid 2 Accent 1" w:uiPriority="68"/>
-    <w:lsdException w:name="Medium Grid 3 Accent 1" w:uiPriority="69"/>
-    <w:lsdException w:name="Dark List Accent 1" w:uiPriority="70"/>
-    <w:lsdException w:name="Colorful Shading Accent 1" w:uiPriority="71"/>
-    <w:lsdException w:name="Colorful List Accent 1" w:uiPriority="72"/>
-    <w:lsdException w:name="Colorful Grid Accent 1" w:uiPriority="73"/>
-    <w:lsdException w:name="Light Shading Accent 2" w:uiPriority="60"/>
-    <w:lsdException w:name="Light List Accent 2" w:uiPriority="61"/>
-    <w:lsdException w:name="Light Grid Accent 2" w:uiPriority="62"/>
-    <w:lsdException w:name="Medium Shading 1 Accent 2" w:uiPriority="63"/>
-    <w:lsdException w:name="Medium Shading 2 Accent 2" w:uiPriority="64"/>
-    <w:lsdException w:name="Medium List 1 Accent 2" w:uiPriority="65"/>
-    <w:lsdException w:name="Medium List 2 Accent 2" w:uiPriority="66"/>
-    <w:lsdException w:name="Medium Grid 1 Accent 2" w:uiPriority="67"/>
-    <w:lsdException w:name="Medium Grid 2 Accent 2" w:uiPriority="68"/>
-    <w:lsdException w:name="Medium Grid 3 Accent 2" w:uiPriority="69"/>
-    <w:lsdException w:name="Dark List Accent 2" w:uiPriority="70"/>
-    <w:lsdException w:name="Colorful Shading Accent 2" w:uiPriority="71"/>
-    <w:lsdException w:name="Colorful List Accent 2" w:uiPriority="72"/>
-    <w:lsdException w:name="Colorful Grid Accent 2" w:uiPriority="73"/>
-    <w:lsdException w:name="Light Shading Accent 3" w:uiPriority="60"/>
-    <w:lsdException w:name="Light List Accent 3" w:uiPriority="61"/>
-    <w:lsdException w:name="Light Grid Accent 3" w:uiPriority="62"/>
-    <w:lsdException w:name="Medium Shading 1 Accent 3" w:uiPriority="63"/>
-    <w:lsdException w:name="Medium Shading 2 Accent 3" w:uiPriority="64"/>
-    <w:lsdException w:name="Medium List 1 Accent 3" w:uiPriority="65"/>
-    <w:lsdException w:name="Medium List 2 Accent 3" w:uiPriority="66"/>
-    <w:lsdException w:name="Medium Grid 1 Accent 3" w:uiPriority="67"/>
-    <w:lsdException w:name="Medium Grid 2 Accent 3" w:uiPriority="68"/>
-    <w:lsdException w:name="Medium Grid 3 Accent 3" w:uiPriority="69"/>
-    <w:lsdException w:name="Dark List Accent 3" w:uiPriority="70"/>
-    <w:lsdException w:name="Colorful Shading Accent 3" w:uiPriority="71"/>
-    <w:lsdException w:name="Colorful List Accent 3" w:uiPriority="72"/>
-    <w:lsdException w:name="Colorful Grid Accent 3" w:uiPriority="73"/>
-    <w:lsdException w:name="Light Shading Accent 4" w:uiPriority="60"/>
-    <w:lsdException w:name="Light List Accent 4" w:uiPriority="61"/>
-    <w:lsdException w:name="Light Grid Accent 4" w:uiPriority="62"/>
-    <w:lsdException w:name="Medium Shading 1 Accent 4" w:uiPriority="63"/>
-    <w:lsdException w:name="Medium Shading 2 Accent 4" w:uiPriority="64"/>
-    <w:lsdException w:name="Medium List 1 Accent 4" w:uiPriority="65"/>
-    <w:lsdException w:name="Medium List 2 Accent 4" w:uiPriority="66"/>
-    <w:lsdException w:name="Medium Grid 1 Accent 4" w:uiPriority="67"/>
-    <w:lsdException w:name="Medium Grid 2 Accent 4" w:uiPriority="68"/>
-    <w:lsdException w:name="Medium Grid 3 Accent 4" w:uiPriority="69"/>
-    <w:lsdException w:name="Dark List Accent 4" w:uiPriority="70"/>
-    <w:lsdException w:name="Colorful Shading Accent 4" w:uiPriority="71"/>
-    <w:lsdException w:name="Colorful List Accent 4" w:uiPriority="72"/>
-    <w:lsdException w:name="Colorful Grid Accent 4" w:uiPriority="73"/>
-    <w:lsdException w:name="Light Shading Accent 5" w:uiPriority="60"/>
-    <w:lsdException w:name="Light List Accent 5" w:uiPriority="61"/>
-    <w:lsdException w:name="Light Grid Accent 5" w:uiPriority="62"/>
-    <w:lsdException w:name="Medium Shading 1 Accent 5" w:uiPriority="63"/>
-    <w:lsdException w:name="Medium Shading 2 Accent 5" w:uiPriority="64"/>
-    <w:lsdException w:name="Medium List 1 Accent 5" w:uiPriority="65"/>
-    <w:lsdException w:name="Medium List 2 Accent 5" w:uiPriority="66"/>
-    <w:lsdException w:name="Medium Grid 1 Accent 5" w:uiPriority="67"/>
-    <w:lsdException w:name="Medium Grid 2 Accent 5" w:uiPriority="68"/>
-    <w:lsdException w:name="Medium Grid 3 Accent 5" w:uiPriority="69"/>
-    <w:lsdException w:name="Dark List Accent 5" w:uiPriority="70"/>
-    <w:lsdException w:name="Colorful Shading Accent 5" w:uiPriority="71"/>
-    <w:lsdException w:name="Colorful List Accent 5" w:uiPriority="72"/>
-    <w:lsdException w:name="Colorful Grid Accent 5" w:uiPriority="73"/>
-    <w:lsdException w:name="Light Shading Accent 6" w:uiPriority="60"/>
-    <w:lsdException w:name="Light List Accent 6" w:uiPriority="61"/>
-    <w:lsdException w:name="Light Grid Accent 6" w:uiPriority="62"/>
-    <w:lsdException w:name="Medium Shading 1 Accent 6" w:uiPriority="63"/>
-    <w:lsdException w:name="Medium Shading 2 Accent 6" w:uiPriority="64"/>
-    <w:lsdException w:name="Medium List 1 Accent 6" w:uiPriority="65"/>
-    <w:lsdException w:name="Medium List 2 Accent 6" w:uiPriority="66"/>
-    <w:lsdException w:name="Medium Grid 1 Accent 6" w:uiPriority="67"/>
-    <w:lsdException w:name="Medium Grid 2 Accent 6" w:uiPriority="68"/>
-    <w:lsdException w:name="Medium Grid 3 Accent 6" w:uiPriority="69"/>
-    <w:lsdException w:name="Dark List Accent 6" w:uiPriority="70"/>
-    <w:lsdException w:name="Colorful Shading Accent 6" w:uiPriority="71"/>
-    <w:lsdException w:name="Colorful List Accent 6" w:uiPriority="72"/>
-    <w:lsdException w:name="Colorful Grid Accent 6" w:uiPriority="73"/>
-    <w:lsdException w:name="Subtle Emphasis" w:uiPriority="19" w:qFormat="1"/>
-    <w:lsdException w:name="Intense Emphasis" w:uiPriority="21" w:qFormat="1"/>
-    <w:lsdException w:name="Subtle Reference" w:uiPriority="31" w:qFormat="1"/>
-    <w:lsdException w:name="Intense Reference" w:uiPriority="32" w:qFormat="1"/>
-    <w:lsdException w:name="Book Title" w:uiPriority="33" w:qFormat="1"/>
-    <w:lsdException w:name="Bibliography" w:semiHidden="1" w:uiPriority="37" w:unhideWhenUsed="1"/>
-    <w:lsdException w:name="TOC Heading" w:semiHidden="1" w:uiPriority="39" w:unhideWhenUsed="1" w:qFormat="1"/>
-    <w:lsdException w:name="Plain Table 1" w:uiPriority="41"/>
-    <w:lsdException w:name="Plain Table 2" w:uiPriority="42"/>
-    <w:lsdException w:name="Plain Table 3" w:uiPriority="43"/>
-    <w:lsdException w:name="Plain Table 4" w:uiPriority="44"/>
-    <w:lsdException w:name="Plain Table 5" w:uiPriority="45"/>
-    <w:lsdException w:name="Grid Table Light" w:uiPriority="40"/>
-    <w:lsdException w:name="Grid Table 1 Light" w:uiPriority="46"/>
-    <w:lsdException w:name="Grid Table 2" w:uiPriority="47"/>
-    <w:lsdException w:name="Grid Table 3" w:uiPriority="48"/>
-    <w:lsdException w:name="Grid Table 4" w:uiPriority="49"/>
-    <w:lsdException w:name="Grid Table 5 Dark" w:uiPriority="50"/>
-    <w:lsdException w:name="Grid Table 6 Colorful" w:uiPriority="51"/>
-    <w:lsdException w:name="Grid Table 7 Colorful" w:uiPriority="52"/>
-    <w:lsdException w:name="Grid Table 1 Light Accent 1" w:uiPriority="46"/>
-    <w:lsdException w:name="Grid Table 2 Accent 1" w:uiPriority="47"/>
-    <w:lsdException w:name="Grid Table 3 Accent 1" w:uiPriority="48"/>
-    <w:lsdException w:name="Grid Table 4 Accent 1" w:uiPriority="49"/>
-    <w:lsdException w:name="Grid Table 5 Dark Accent 1" w:uiPriority="50"/>
-    <w:lsdException w:name="Grid Table 6 Colorful Accent 1" w:uiPriority="51"/>
-    <w:lsdException w:name="Grid Table 7 Colorful Accent 1" w:uiPriority="52"/>
-    <w:lsdException w:name="Grid Table 1 Light Accent 2" w:uiPriority="46"/>
-    <w:lsdException w:name="Grid Table 2 Accent 2" w:uiPriority="47"/>
-    <w:lsdException w:name="Grid Table 3 Accent 2" w:uiPriority="48"/>
-    <w:lsdException w:name="Grid Table 4 Accent 2" w:uiPriority="49"/>
-    <w:lsdException w:name="Grid Table 5 Dark Accent 2" w:uiPriority="50"/>
-    <w:lsdException w:name="Grid Table 6 Colorful Accent 2" w:uiPriority="51"/>
-    <w:lsdException w:name="Grid Table 7 Colorful Accent 2" w:uiPriority="52"/>
-    <w:lsdException w:name="Grid Table 1 Light Accent 3" w:uiPriority="46"/>
-    <w:lsdException w:name="Grid Table 2 Accent 3" w:uiPriority="47"/>
-    <w:lsdException w:name="Grid Table 3 Accent 3" w:uiPriority="48"/>
-    <w:lsdException w:name="Grid Table 4 Accent 3" w:uiPriority="49"/>
-    <w:lsdException w:name="Grid Table 5 Dark Accent 3" w:uiPriority="50"/>
-    <w:lsdException w:name="Grid Table 6 Colorful Accent 3" w:uiPriority="51"/>
-    <w:lsdException w:name="Grid Table 7 Colorful Accent 3" w:uiPriority="52"/>
-    <w:lsdException w:name="Grid Table 1 Light Accent 4" w:uiPriority="46"/>
-    <w:lsdException w:name="Grid Table 2 Accent 4" w:uiPriority="47"/>
-    <w:lsdException w:name="Grid Table 3 Accent 4" w:uiPriority="48"/>
-    <w:lsdException w:name="Grid Table 4 Accent 4" w:uiPriority="49"/>
-    <w:lsdException w:name="Grid Table 5 Dark Accent 4" w:uiPriority="50"/>
-    <w:lsdException w:name="Grid Table 6 Colorful Accent 4" w:uiPriority="51"/>
-    <w:lsdException w:name="Grid Table 7 Colorful Accent 4" w:uiPriority="52"/>
-    <w:lsdException w:name="Grid Table 1 Light Accent 5" w:uiPriority="46"/>
-    <w:lsdException w:name="Grid Table 2 Accent 5" w:uiPriority="47"/>
-    <w:lsdException w:name="Grid Table 3 Accent 5" w:uiPriority="48"/>
-    <w:lsdException w:name="Grid Table 4 Accent 5" w:uiPriority="49"/>
-    <w:lsdException w:name="Grid Table 5 Dark Accent 5" w:uiPriority="50"/>
-    <w:lsdException w:name="Grid Table 6 Colorful Accent 5" w:uiPriority="51"/>
-    <w:lsdException w:name="Grid Table 7 Colorful Accent 5" w:uiPriority="52"/>
-    <w:lsdException w:name="Grid Table 1 Light Accent 6" w:uiPriority="46"/>
-    <w:lsdException w:name="Grid Table 2 Accent 6" w:uiPriority="47"/>
-    <w:lsdException w:name="Grid Table 3 Accent 6" w:uiPriority="48"/>
-    <w:lsdException w:name="Grid Table 4 Accent 6" w:uiPriority="49"/>
-    <w:lsdException w:name="Grid Table 5 Dark Accent 6" w:uiPriority="50"/>
-    <w:lsdException w:name="Grid Table 6 Colorful Accent 6" w:uiPriority="51"/>
-    <w:lsdException w:name="Grid Table 7 Colorful Accent 6" w:uiPriority="52"/>
-    <w:lsdException w:name="List Table 1 Light" w:uiPriority="46"/>
-    <w:lsdException w:name="List Table 2" w:uiPriority="47"/>
-    <w:lsdException w:name="List Table 3" w:uiPriority="48"/>
-    <w:lsdException w:name="List Table 4" w:uiPriority="49"/>
-    <w:lsdException w:name="List Table 5 Dark" w:uiPriority="50"/>
-    <w:lsdException w:name="List Table 6 Colorful" w:uiPriority="51"/>
-    <w:lsdException w:name="List Table 7 Colorful" w:uiPriority="52"/>
-    <w:lsdException w:name="List Table 1 Light Accent 1" w:uiPriority="46"/>
-    <w:lsdException w:name="List Table 2 Accent 1" w:uiPriority="47"/>
-    <w:lsdException w:name="List Table 3 Accent 1" w:uiPriority="48"/>
-    <w:lsdException w:name="List Table 4 Accent 1" w:uiPriority="49"/>
-    <w:lsdException w:name="List Table 5 Dark Accent 1" w:uiPriority="50"/>
-    <w:lsdException w:name="List Table 6 Colorful Accent 1" w:uiPriority="51"/>
-    <w:lsdException w:name="List Table 7 Colorful Accent 1" w:uiPriority="52"/>
-    <w:lsdException w:name="List Table 1 Light Accent 2" w:uiPriority="46"/>
-    <w:lsdException w:name="List Table 2 Accent 2" w:uiPriority="47"/>
-    <w:lsdException w:name="List Table 3 Accent 2" w:uiPriority="48"/>
-    <w:lsdException w:name="List Table 4 Accent 2" w:uiPriority="49"/>
-    <w:lsdException w:name="List Table 5 Dark Accent 2" w:uiPriority="50"/>
-    <w:lsdException w:name="List Table 6 Colorful Accent 2" w:uiPriority="51"/>
-    <w:lsdException w:name="List Table 7 Colorful Accent 2" w:uiPriority="52"/>
-    <w:lsdException w:name="List Table 1 Light Accent 3" w:uiPriority="46"/>
-    <w:lsdException w:name="List Table 2 Accent 3" w:uiPriority="47"/>
-    <w:lsdException w:name="List Table 3 Accent 3" w:uiPriority="48"/>
-    <w:lsdException w:name="List Table 4 Accent 3" w:uiPriority="49"/>
-    <w:lsdException w:name="List Table 5 Dark Accent 3" w:uiPriority="50"/>
-    <w:lsdException w:name="List Table 6 Colorful Accent 3" w:uiPriority="51"/>
-    <w:lsdException w:name="List Table 7 Colorful Accent 3" w:uiPriority="52"/>
-    <w:lsdException w:name="List Table 1 Light Accent 4" w:uiPriority="46"/>
-    <w:lsdException w:name="List Table 2 Accent 4" w:uiPriority="47"/>
-    <w:lsdException w:name="List Table 3 Accent 4" w:uiPriority="48"/>
-    <w:lsdException w:name="List Table 4 Accent 4" w:uiPriority="49"/>
-    <w:lsdException w:name="List Table 5 Dark Accent 4" w:uiPriority="50"/>
-    <w:lsdException w:name="List Table 6 Colorful Accent 4" w:uiPriority="51"/>
-    <w:lsdException w:name="List Table 7 Colorful Accent 4" w:uiPriority="52"/>
-    <w:lsdException w:name="List Table 1 Light Accent 5" w:uiPriority="46"/>
-    <w:lsdException w:name="List Table 2 Accent 5" w:uiPriority="47"/>
-    <w:lsdException w:name="List Table 3 Accent 5" w:uiPriority="48"/>
-    <w:lsdException w:name="List Table 4 Accent 5" w:uiPriority="49"/>
-    <w:lsdException w:name="List Table 5 Dark Accent 5" w:uiPriority="50"/>
-    <w:lsdException w:name="List Table 6 Colorful Accent 5" w:uiPriority="51"/>
-    <w:lsdException w:name="List Table 7 Colorful Accent 5" w:uiPriority="52"/>
-    <w:lsdException w:name="List Table 1 Light Accent 6" w:uiPriority="46"/>
-    <w:lsdException w:name="List Table 2 Accent 6" w:uiPriority="47"/>
-    <w:lsdException w:name="List Table 3 Accent 6" w:uiPriority="48"/>
-    <w:lsdException w:name="List Table 4 Accent 6" w:uiPriority="49"/>
-    <w:lsdException w:name="List Table 5 Dark Accent 6" w:uiPriority="50"/>
-    <w:lsdException w:name="List Table 6 Colorful Accent 6" w:uiPriority="51"/>
-    <w:lsdException w:name="List Table 7 Colorful Accent 6" w:uiPriority="52"/>
+  <w:latentStyles w:defLockedState="0" w:defUIPriority="99" w:defSemiHidden="1" w:defUnhideWhenUsed="1" w:defQFormat="0" w:count="267">
+    <w:lsdException w:name="Normal" w:semiHidden="0" w:uiPriority="0" w:unhideWhenUsed="0" w:qFormat="1"/>
+    <w:lsdException w:name="heading 1" w:semiHidden="0" w:uiPriority="9" w:unhideWhenUsed="0" w:qFormat="1"/>
+    <w:lsdException w:name="heading 2" w:uiPriority="9" w:qFormat="1"/>
+    <w:lsdException w:name="heading 3" w:uiPriority="9" w:qFormat="1"/>
+    <w:lsdException w:name="heading 4" w:uiPriority="9" w:qFormat="1"/>
+    <w:lsdException w:name="heading 5" w:uiPriority="9" w:qFormat="1"/>
+    <w:lsdException w:name="heading 6" w:uiPriority="9" w:qFormat="1"/>
+    <w:lsdException w:name="heading 7" w:uiPriority="9" w:qFormat="1"/>
+    <w:lsdException w:name="heading 8" w:uiPriority="9" w:qFormat="1"/>
+    <w:lsdException w:name="heading 9" w:uiPriority="9" w:qFormat="1"/>
+    <w:lsdException w:name="toc 1" w:uiPriority="39"/>
+    <w:lsdException w:name="toc 2" w:uiPriority="39"/>
+    <w:lsdException w:name="toc 3" w:uiPriority="39"/>
+    <w:lsdException w:name="toc 4" w:uiPriority="39"/>
+    <w:lsdException w:name="toc 5" w:uiPriority="39"/>
+    <w:lsdException w:name="toc 6" w:uiPriority="39"/>
+    <w:lsdException w:name="toc 7" w:uiPriority="39"/>
+    <w:lsdException w:name="toc 8" w:uiPriority="39"/>
+    <w:lsdException w:name="toc 9" w:uiPriority="39"/>
+    <w:lsdException w:name="caption" w:uiPriority="35" w:qFormat="1"/>
+    <w:lsdException w:name="Title" w:semiHidden="0" w:uiPriority="10" w:unhideWhenUsed="0" w:qFormat="1"/>
+    <w:lsdException w:name="Default Paragraph Font" w:uiPriority="1"/>
+    <w:lsdException w:name="Subtitle" w:semiHidden="0" w:uiPriority="11" w:unhideWhenUsed="0" w:qFormat="1"/>
+    <w:lsdException w:name="Strong" w:semiHidden="0" w:uiPriority="22" w:unhideWhenUsed="0" w:qFormat="1"/>
+    <w:lsdException w:name="Emphasis" w:semiHidden="0" w:uiPriority="20" w:unhideWhenUsed="0" w:qFormat="1"/>
+    <w:lsdException w:name="Table Grid" w:semiHidden="0" w:uiPriority="39" w:unhideWhenUsed="0"/>
+    <w:lsdException w:name="Placeholder Text" w:unhideWhenUsed="0"/>
+    <w:lsdException w:name="No Spacing" w:semiHidden="0" w:uiPriority="1" w:unhideWhenUsed="0" w:qFormat="1"/>
+    <w:lsdException w:name="Light Shading" w:semiHidden="0" w:uiPriority="60" w:unhideWhenUsed="0"/>
+    <w:lsdException w:name="Light List" w:semiHidden="0" w:uiPriority="61" w:unhideWhenUsed="0"/>
+    <w:lsdException w:name="Light Grid" w:semiHidden="0" w:uiPriority="62" w:unhideWhenUsed="0"/>
+    <w:lsdException w:name="Medium Shading 1" w:semiHidden="0" w:uiPriority="63" w:unhideWhenUsed="0"/>
+    <w:lsdException w:name="Medium Shading 2" w:semiHidden="0" w:uiPriority="64" w:unhideWhenUsed="0"/>
+    <w:lsdException w:name="Medium List 1" w:semiHidden="0" w:uiPriority="65" w:unhideWhenUsed="0"/>
+    <w:lsdException w:name="Medium List 2" w:semiHidden="0" w:uiPriority="66" w:unhideWhenUsed="0"/>
+    <w:lsdException w:name="Medium Grid 1" w:semiHidden="0" w:uiPriority="67" w:unhideWhenUsed="0"/>
+    <w:lsdException w:name="Medium Grid 2" w:semiHidden="0" w:uiPriority="68" w:unhideWhenUsed="0"/>
+    <w:lsdException w:name="Medium Grid 3" w:semiHidden="0" w:uiPriority="69" w:unhideWhenUsed="0"/>
+    <w:lsdException w:name="Dark List" w:semiHidden="0" w:uiPriority="70" w:unhideWhenUsed="0"/>
+    <w:lsdException w:name="Colorful Shading" w:semiHidden="0" w:uiPriority="71" w:unhideWhenUsed="0"/>
+    <w:lsdException w:name="Colorful List" w:semiHidden="0" w:uiPriority="72" w:unhideWhenUsed="0"/>
+    <w:lsdException w:name="Colorful Grid" w:semiHidden="0" w:uiPriority="73" w:unhideWhenUsed="0"/>
+    <w:lsdException w:name="Light Shading Accent 1" w:semiHidden="0" w:uiPriority="60" w:unhideWhenUsed="0"/>
+    <w:lsdException w:name="Light List Accent 1" w:semiHidden="0" w:uiPriority="61" w:unhideWhenUsed="0"/>
+    <w:lsdException w:name="Light Grid Accent 1" w:semiHidden="0" w:uiPriority="62" w:unhideWhenUsed="0"/>
+    <w:lsdException w:name="Medium Shading 1 Accent 1" w:semiHidden="0" w:uiPriority="63" w:unhideWhenUsed="0"/>
+    <w:lsdException w:name="Medium Shading 2 Accent 1" w:semiHidden="0" w:uiPriority="64" w:unhideWhenUsed="0"/>
+    <w:lsdException w:name="Medium List 1 Accent 1" w:semiHidden="0" w:uiPriority="65" w:unhideWhenUsed="0"/>
+    <w:lsdException w:name="Revision" w:unhideWhenUsed="0"/>
+    <w:lsdException w:name="List Paragraph" w:semiHidden="0" w:uiPriority="34" w:unhideWhenUsed="0" w:qFormat="1"/>
+    <w:lsdException w:name="Quote" w:semiHidden="0" w:uiPriority="29" w:unhideWhenUsed="0" w:qFormat="1"/>
+    <w:lsdException w:name="Intense Quote" w:semiHidden="0" w:uiPriority="30" w:unhideWhenUsed="0" w:qFormat="1"/>
+    <w:lsdException w:name="Medium List 2 Accent 1" w:semiHidden="0" w:uiPriority="66" w:unhideWhenUsed="0"/>
+    <w:lsdException w:name="Medium Grid 1 Accent 1" w:semiHidden="0" w:uiPriority="67" w:unhideWhenUsed="0"/>
+    <w:lsdException w:name="Medium Grid 2 Accent 1" w:semiHidden="0" w:uiPriority="68" w:unhideWhenUsed="0"/>
+    <w:lsdException w:name="Medium Grid 3 Accent 1" w:semiHidden="0" w:uiPriority="69" w:unhideWhenUsed="0"/>
+    <w:lsdException w:name="Dark List Accent 1" w:semiHidden="0" w:uiPriority="70" w:unhideWhenUsed="0"/>
+    <w:lsdException w:name="Colorful Shading Accent 1" w:semiHidden="0" w:uiPriority="71" w:unhideWhenUsed="0"/>
+    <w:lsdException w:name="Colorful List Accent 1" w:semiHidden="0" w:uiPriority="72" w:unhideWhenUsed="0"/>
+    <w:lsdException w:name="Colorful Grid Accent 1" w:semiHidden="0" w:uiPriority="73" w:unhideWhenUsed="0"/>
+    <w:lsdException w:name="Light Shading Accent 2" w:semiHidden="0" w:uiPriority="60" w:unhideWhenUsed="0"/>
+    <w:lsdException w:name="Light List Accent 2" w:semiHidden="0" w:uiPriority="61" w:unhideWhenUsed="0"/>
+    <w:lsdException w:name="Light Grid Accent 2" w:semiHidden="0" w:uiPriority="62" w:unhideWhenUsed="0"/>
+    <w:lsdException w:name="Medium Shading 1 Accent 2" w:semiHidden="0" w:uiPriority="63" w:unhideWhenUsed="0"/>
+    <w:lsdException w:name="Medium Shading 2 Accent 2" w:semiHidden="0" w:uiPriority="64" w:unhideWhenUsed="0"/>
+    <w:lsdException w:name="Medium List 1 Accent 2" w:semiHidden="0" w:uiPriority="65" w:unhideWhenUsed="0"/>
+    <w:lsdException w:name="Medium List 2 Accent 2" w:semiHidden="0" w:uiPriority="66" w:unhideWhenUsed="0"/>
+    <w:lsdException w:name="Medium Grid 1 Accent 2" w:semiHidden="0" w:uiPriority="67" w:unhideWhenUsed="0"/>
+    <w:lsdException w:name="Medium Grid 2 Accent 2" w:semiHidden="0" w:uiPriority="68" w:unhideWhenUsed="0"/>
+    <w:lsdException w:name="Medium Grid 3 Accent 2" w:semiHidden="0" w:uiPriority="69" w:unhideWhenUsed="0"/>
+    <w:lsdException w:name="Dark List Accent 2" w:semiHidden="0" w:uiPriority="70" w:unhideWhenUsed="0"/>
+    <w:lsdException w:name="Colorful Shading Accent 2" w:semiHidden="0" w:uiPriority="71" w:unhideWhenUsed="0"/>
+    <w:lsdException w:name="Colorful List Accent 2" w:semiHidden="0" w:uiPriority="72" w:unhideWhenUsed="0"/>
+    <w:lsdException w:name="Colorful Grid Accent 2" w:semiHidden="0" w:uiPriority="73" w:unhideWhenUsed="0"/>
+    <w:lsdException w:name="Light Shading Accent 3" w:semiHidden="0" w:uiPriority="60" w:unhideWhenUsed="0"/>
+    <w:lsdException w:name="Light List Accent 3" w:semiHidden="0" w:uiPriority="61" w:unhideWhenUsed="0"/>
+    <w:lsdException w:name="Light Grid Accent 3" w:semiHidden="0" w:uiPriority="62" w:unhideWhenUsed="0"/>
+    <w:lsdException w:name="Medium Shading 1 Accent 3" w:semiHidden="0" w:uiPriority="63" w:unhideWhenUsed="0"/>
+    <w:lsdException w:name="Medium Shading 2 Accent 3" w:semiHidden="0" w:uiPriority="64" w:unhideWhenUsed="0"/>
+    <w:lsdException w:name="Medium List 1 Accent 3" w:semiHidden="0" w:uiPriority="65" w:unhideWhenUsed="0"/>
+    <w:lsdException w:name="Medium List 2 Accent 3" w:semiHidden="0" w:uiPriority="66" w:unhideWhenUsed="0"/>
+    <w:lsdException w:name="Medium Grid 1 Accent 3" w:semiHidden="0" w:uiPriority="67" w:unhideWhenUsed="0"/>
+    <w:lsdException w:name="Medium Grid 2 Accent 3" w:semiHidden="0" w:uiPriority="68" w:unhideWhenUsed="0"/>
+    <w:lsdException w:name="Medium Grid 3 Accent 3" w:semiHidden="0" w:uiPriority="69" w:unhideWhenUsed="0"/>
+    <w:lsdException w:name="Dark List Accent 3" w:semiHidden="0" w:uiPriority="70" w:unhideWhenUsed="0"/>
+    <w:lsdException w:name="Colorful Shading Accent 3" w:semiHidden="0" w:uiPriority="71" w:unhideWhenUsed="0"/>
+    <w:lsdException w:name="Colorful List Accent 3" w:semiHidden="0" w:uiPriority="72" w:unhideWhenUsed="0"/>
+    <w:lsdException w:name="Colorful Grid Accent 3" w:semiHidden="0" w:uiPriority="73" w:unhideWhenUsed="0"/>
+    <w:lsdException w:name="Light Shading Accent 4" w:semiHidden="0" w:uiPriority="60" w:unhideWhenUsed="0"/>
+    <w:lsdException w:name="Light List Accent 4" w:semiHidden="0" w:uiPriority="61" w:unhideWhenUsed="0"/>
+    <w:lsdException w:name="Light Grid Accent 4" w:semiHidden="0" w:uiPriority="62" w:unhideWhenUsed="0"/>
+    <w:lsdException w:name="Medium Shading 1 Accent 4" w:semiHidden="0" w:uiPriority="63" w:unhideWhenUsed="0"/>
+    <w:lsdException w:name="Medium Shading 2 Accent 4" w:semiHidden="0" w:uiPriority="64" w:unhideWhenUsed="0"/>
+    <w:lsdException w:name="Medium List 1 Accent 4" w:semiHidden="0" w:uiPriority="65" w:unhideWhenUsed="0"/>
+    <w:lsdException w:name="Medium List 2 Accent 4" w:semiHidden="0" w:uiPriority="66" w:unhideWhenUsed="0"/>
+    <w:lsdException w:name="Medium Grid 1 Accent 4" w:semiHidden="0" w:uiPriority="67" w:unhideWhenUsed="0"/>
+    <w:lsdException w:name="Medium Grid 2 Accent 4" w:semiHidden="0" w:uiPriority="68" w:unhideWhenUsed="0"/>
+    <w:lsdException w:name="Medium Grid 3 Accent 4" w:semiHidden="0" w:uiPriority="69" w:unhideWhenUsed="0"/>
+    <w:lsdException w:name="Dark List Accent 4" w:semiHidden="0" w:uiPriority="70" w:unhideWhenUsed="0"/>
+    <w:lsdException w:name="Colorful Shading Accent 4" w:semiHidden="0" w:uiPriority="71" w:unhideWhenUsed="0"/>
+    <w:lsdException w:name="Colorful List Accent 4" w:semiHidden="0" w:uiPriority="72" w:unhideWhenUsed="0"/>
+    <w:lsdException w:name="Colorful Grid Accent 4" w:semiHidden="0" w:uiPriority="73" w:unhideWhenUsed="0"/>
+    <w:lsdException w:name="Light Shading Accent 5" w:semiHidden="0" w:uiPriority="60" w:unhideWhenUsed="0"/>
+    <w:lsdException w:name="Light List Accent 5" w:semiHidden="0" w:uiPriority="61" w:unhideWhenUsed="0"/>
+    <w:lsdException w:name="Light Grid Accent 5" w:semiHidden="0" w:uiPriority="62" w:unhideWhenUsed="0"/>
+    <w:lsdException w:name="Medium Shading 1 Accent 5" w:semiHidden="0" w:uiPriority="63" w:unhideWhenUsed="0"/>
+    <w:lsdException w:name="Medium Shading 2 Accent 5" w:semiHidden="0" w:uiPriority="64" w:unhideWhenUsed="0"/>
+    <w:lsdException w:name="Medium List 1 Accent 5" w:semiHidden="0" w:uiPriority="65" w:unhideWhenUsed="0"/>
+    <w:lsdException w:name="Medium List 2 Accent 5" w:semiHidden="0" w:uiPriority="66" w:unhideWhenUsed="0"/>
+    <w:lsdException w:name="Medium Grid 1 Accent 5" w:semiHidden="0" w:uiPriority="67" w:unhideWhenUsed="0"/>
+    <w:lsdException w:name="Medium Grid 2 Accent 5" w:semiHidden="0" w:uiPriority="68" w:unhideWhenUsed="0"/>
+    <w:lsdException w:name="Medium Grid 3 Accent 5" w:semiHidden="0" w:uiPriority="69" w:unhideWhenUsed="0"/>
+    <w:lsdException w:name="Dark List Accent 5" w:semiHidden="0" w:uiPriority="70" w:unhideWhenUsed="0"/>
+    <w:lsdException w:name="Colorful Shading Accent 5" w:semiHidden="0" w:uiPriority="71" w:unhideWhenUsed="0"/>
+    <w:lsdException w:name="Colorful List Accent 5" w:semiHidden="0" w:uiPriority="72" w:unhideWhenUsed="0"/>
+    <w:lsdException w:name="Colorful Grid Accent 5" w:semiHidden="0" w:uiPriority="73" w:unhideWhenUsed="0"/>
+    <w:lsdException w:name="Light Shading Accent 6" w:semiHidden="0" w:uiPriority="60" w:unhideWhenUsed="0"/>
+    <w:lsdException w:name="Light List Accent 6" w:semiHidden="0" w:uiPriority="61" w:unhideWhenUsed="0"/>
+    <w:lsdException w:name="Light Grid Accent 6" w:semiHidden="0" w:uiPriority="62" w:unhideWhenUsed="0"/>
+    <w:lsdException w:name="Medium Shading 1 Accent 6" w:semiHidden="0" w:uiPriority="63" w:unhideWhenUsed="0"/>
+    <w:lsdException w:name="Medium Shading 2 Accent 6" w:semiHidden="0" w:uiPriority="64" w:unhideWhenUsed="0"/>
+    <w:lsdException w:name="Medium List 1 Accent 6" w:semiHidden="0" w:uiPriority="65" w:unhideWhenUsed="0"/>
+    <w:lsdException w:name="Medium List 2 Accent 6" w:semiHidden="0" w:uiPriority="66" w:unhideWhenUsed="0"/>
+    <w:lsdException w:name="Medium Grid 1 Accent 6" w:semiHidden="0" w:uiPriority="67" w:unhideWhenUsed="0"/>
+    <w:lsdException w:name="Medium Grid 2 Accent 6" w:semiHidden="0" w:uiPriority="68" w:unhideWhenUsed="0"/>
+    <w:lsdException w:name="Medium Grid 3 Accent 6" w:semiHidden="0" w:uiPriority="69" w:unhideWhenUsed="0"/>
+    <w:lsdException w:name="Dark List Accent 6" w:semiHidden="0" w:uiPriority="70" w:unhideWhenUsed="0"/>
+    <w:lsdException w:name="Colorful Shading Accent 6" w:semiHidden="0" w:uiPriority="71" w:unhideWhenUsed="0"/>
+    <w:lsdException w:name="Colorful List Accent 6" w:semiHidden="0" w:uiPriority="72" w:unhideWhenUsed="0"/>
+    <w:lsdException w:name="Colorful Grid Accent 6" w:semiHidden="0" w:uiPriority="73" w:unhideWhenUsed="0"/>
+    <w:lsdException w:name="Subtle Emphasis" w:semiHidden="0" w:uiPriority="19" w:unhideWhenUsed="0" w:qFormat="1"/>
+    <w:lsdException w:name="Intense Emphasis" w:semiHidden="0" w:uiPriority="21" w:unhideWhenUsed="0" w:qFormat="1"/>
+    <w:lsdException w:name="Subtle Reference" w:semiHidden="0" w:uiPriority="31" w:unhideWhenUsed="0" w:qFormat="1"/>
+    <w:lsdException w:name="Intense Reference" w:semiHidden="0" w:uiPriority="32" w:unhideWhenUsed="0" w:qFormat="1"/>
+    <w:lsdException w:name="Book Title" w:semiHidden="0" w:uiPriority="33" w:unhideWhenUsed="0" w:qFormat="1"/>
+    <w:lsdException w:name="Bibliography" w:uiPriority="37"/>
+    <w:lsdException w:name="TOC Heading" w:uiPriority="39" w:qFormat="1"/>
   </w:latentStyles>
   <w:style w:type="paragraph" w:default="1" w:styleId="Normal">
     <w:name w:val="Normal"/>
@@ -3086,6 +3299,7 @@
     <w:uiPriority w:val="99"/>
     <w:semiHidden/>
     <w:unhideWhenUsed/>
+    <w:qFormat/>
     <w:tblPr>
       <w:tblInd w:w="0" w:type="dxa"/>
       <w:tblCellMar>
@@ -3562,11 +3776,24 @@
     <w:uiPriority w:val="1"/>
     <w:rsid w:val="00690C89"/>
   </w:style>
+  <w:style w:type="paragraph" w:styleId="TOC3">
+    <w:name w:val="toc 3"/>
+    <w:basedOn w:val="Normal"/>
+    <w:next w:val="Normal"/>
+    <w:autoRedefine/>
+    <w:uiPriority w:val="39"/>
+    <w:unhideWhenUsed/>
+    <w:rsid w:val="00135012"/>
+    <w:pPr>
+      <w:spacing w:after="100"/>
+      <w:ind w:left="420"/>
+    </w:pPr>
+  </w:style>
 </w:styles>
 </file>
 
 <file path=word/glossary/document.xml><?xml version="1.0" encoding="utf-8"?>
-<w:glossaryDocument xmlns:wpc="http://schemas.microsoft.com/office/word/2010/wordprocessingCanvas" xmlns:mc="http://schemas.openxmlformats.org/markup-compatibility/2006" xmlns:o="urn:schemas-microsoft-com:office:office" xmlns:r="http://schemas.openxmlformats.org/officeDocument/2006/relationships" xmlns:m="http://schemas.openxmlformats.org/officeDocument/2006/math" xmlns:v="urn:schemas-microsoft-com:vml" xmlns:wp14="http://schemas.microsoft.com/office/word/2010/wordprocessingDrawing" xmlns:wp="http://schemas.openxmlformats.org/drawingml/2006/wordprocessingDrawing" xmlns:w10="urn:schemas-microsoft-com:office:word" xmlns:w="http://schemas.openxmlformats.org/wordprocessingml/2006/main" xmlns:w14="http://schemas.microsoft.com/office/word/2010/wordml" xmlns:w15="http://schemas.microsoft.com/office/word/2012/wordml" xmlns:wpg="http://schemas.microsoft.com/office/word/2010/wordprocessingGroup" xmlns:wpi="http://schemas.microsoft.com/office/word/2010/wordprocessingInk" xmlns:wne="http://schemas.microsoft.com/office/word/2006/wordml" xmlns:wps="http://schemas.microsoft.com/office/word/2010/wordprocessingShape" mc:Ignorable="w14 w15 wp14">
+<w:glossaryDocument xmlns:ve="http://schemas.openxmlformats.org/markup-compatibility/2006" xmlns:o="urn:schemas-microsoft-com:office:office" xmlns:r="http://schemas.openxmlformats.org/officeDocument/2006/relationships" xmlns:m="http://schemas.openxmlformats.org/officeDocument/2006/math" xmlns:v="urn:schemas-microsoft-com:vml" xmlns:wp="http://schemas.openxmlformats.org/drawingml/2006/wordprocessingDrawing" xmlns:w10="urn:schemas-microsoft-com:office:word" xmlns:w="http://schemas.openxmlformats.org/wordprocessingml/2006/main" xmlns:wne="http://schemas.microsoft.com/office/word/2006/wordml">
   <w:docParts>
     <w:docPart>
       <w:docPartPr>
@@ -3629,43 +3856,12 @@
         </w:p>
       </w:docPartBody>
     </w:docPart>
-    <w:docPart>
-      <w:docPartPr>
-        <w:name w:val="3F999BE63CD04C79A55A40D73867033F"/>
-        <w:category>
-          <w:name w:val="General"/>
-          <w:gallery w:val="placeholder"/>
-        </w:category>
-        <w:types>
-          <w:type w:val="bbPlcHdr"/>
-        </w:types>
-        <w:behaviors>
-          <w:behavior w:val="content"/>
-        </w:behaviors>
-        <w:guid w:val="{E92C2E27-24EE-4667-9C7C-E2F2EF9DFB7A}"/>
-      </w:docPartPr>
-      <w:docPartBody>
-        <w:p>
-          <w:pPr>
-            <w:pStyle w:val="3F999BE63CD04C79A55A40D73867033F"/>
-          </w:pPr>
-          <w:r>
-            <w:rPr>
-              <w:rFonts w:asciiTheme="majorHAnsi" w:eastAsiaTheme="majorEastAsia" w:hAnsiTheme="majorHAnsi" w:cstheme="majorBidi"/>
-              <w:sz w:val="44"/>
-              <w:szCs w:val="44"/>
-            </w:rPr>
-            <w:t>[Type the document subtitle]</w:t>
-          </w:r>
-        </w:p>
-      </w:docPartBody>
-    </w:docPart>
   </w:docParts>
 </w:glossaryDocument>
 </file>
 
 <file path=word/glossary/fontTable.xml><?xml version="1.0" encoding="utf-8"?>
-<w:fonts xmlns:mc="http://schemas.openxmlformats.org/markup-compatibility/2006" xmlns:r="http://schemas.openxmlformats.org/officeDocument/2006/relationships" xmlns:w="http://schemas.openxmlformats.org/wordprocessingml/2006/main" xmlns:w14="http://schemas.microsoft.com/office/word/2010/wordml" xmlns:w15="http://schemas.microsoft.com/office/word/2012/wordml" mc:Ignorable="w14 w15">
+<w:fonts xmlns:r="http://schemas.openxmlformats.org/officeDocument/2006/relationships" xmlns:w="http://schemas.openxmlformats.org/wordprocessingml/2006/main">
   <w:font w:name="Symbol">
     <w:panose1 w:val="05050102010706020507"/>
     <w:charset w:val="02"/>
@@ -3716,27 +3912,27 @@
     <w:pitch w:val="variable"/>
     <w:sig w:usb0="E00002FF" w:usb1="4000ACFF" w:usb2="00000001" w:usb3="00000000" w:csb0="0000019F" w:csb1="00000000"/>
   </w:font>
-  <w:font w:name="Calibri Light">
-    <w:panose1 w:val="020F0302020204030204"/>
+  <w:font w:name="Cambria">
+    <w:panose1 w:val="02040503050406030204"/>
     <w:charset w:val="00"/>
-    <w:family w:val="swiss"/>
+    <w:family w:val="roman"/>
     <w:pitch w:val="variable"/>
-    <w:sig w:usb0="A00002EF" w:usb1="4000207B" w:usb2="00000000" w:usb3="00000000" w:csb0="0000019F" w:csb1="00000000"/>
+    <w:sig w:usb0="E00002FF" w:usb1="400004FF" w:usb2="00000000" w:usb3="00000000" w:csb0="0000019F" w:csb1="00000000"/>
   </w:font>
 </w:fonts>
 </file>
 
 <file path=word/glossary/settings.xml><?xml version="1.0" encoding="utf-8"?>
-<w:settings xmlns:mc="http://schemas.openxmlformats.org/markup-compatibility/2006" xmlns:o="urn:schemas-microsoft-com:office:office" xmlns:r="http://schemas.openxmlformats.org/officeDocument/2006/relationships" xmlns:m="http://schemas.openxmlformats.org/officeDocument/2006/math" xmlns:v="urn:schemas-microsoft-com:vml" xmlns:w10="urn:schemas-microsoft-com:office:word" xmlns:w="http://schemas.openxmlformats.org/wordprocessingml/2006/main" xmlns:w14="http://schemas.microsoft.com/office/word/2010/wordml" xmlns:w15="http://schemas.microsoft.com/office/word/2012/wordml" xmlns:sl="http://schemas.openxmlformats.org/schemaLibrary/2006/main" mc:Ignorable="w14 w15">
+<w:settings xmlns:o="urn:schemas-microsoft-com:office:office" xmlns:r="http://schemas.openxmlformats.org/officeDocument/2006/relationships" xmlns:m="http://schemas.openxmlformats.org/officeDocument/2006/math" xmlns:v="urn:schemas-microsoft-com:vml" xmlns:w10="urn:schemas-microsoft-com:office:word" xmlns:w="http://schemas.openxmlformats.org/wordprocessingml/2006/main" xmlns:sl="http://schemas.openxmlformats.org/schemaLibrary/2006/main">
   <w:view w:val="normal"/>
   <w:defaultTabStop w:val="720"/>
   <w:characterSpacingControl w:val="doNotCompress"/>
   <w:compat>
     <w:useFELayout/>
-    <w:compatSetting w:name="compatibilityMode" w:uri="http://schemas.microsoft.com/office/word" w:val="12"/>
   </w:compat>
   <w:rsids>
     <w:rsidRoot w:val="007A6147"/>
+    <w:rsid w:val="003834BE"/>
     <w:rsid w:val="005B0C18"/>
     <w:rsid w:val="005F3699"/>
     <w:rsid w:val="007A6147"/>
@@ -3749,7 +3945,7 @@
     <m:mathFont m:val="Cambria Math"/>
     <m:brkBin m:val="before"/>
     <m:brkBinSub m:val="--"/>
-    <m:smallFrac m:val="0"/>
+    <m:smallFrac m:val="off"/>
     <m:dispDef/>
     <m:lMargin m:val="0"/>
     <m:rMargin m:val="0"/>
@@ -3766,7 +3962,7 @@
 </file>
 
 <file path=word/glossary/styles.xml><?xml version="1.0" encoding="utf-8"?>
-<w:styles xmlns:mc="http://schemas.openxmlformats.org/markup-compatibility/2006" xmlns:r="http://schemas.openxmlformats.org/officeDocument/2006/relationships" xmlns:w="http://schemas.openxmlformats.org/wordprocessingml/2006/main" xmlns:w14="http://schemas.microsoft.com/office/word/2010/wordml" xmlns:w15="http://schemas.microsoft.com/office/word/2012/wordml" mc:Ignorable="w14 w15">
+<w:styles xmlns:r="http://schemas.openxmlformats.org/officeDocument/2006/relationships" xmlns:w="http://schemas.openxmlformats.org/wordprocessingml/2006/main">
   <w:docDefaults>
     <w:rPrDefault>
       <w:rPr>
@@ -3782,378 +3978,144 @@
       </w:pPr>
     </w:pPrDefault>
   </w:docDefaults>
-  <w:latentStyles w:defLockedState="0" w:defUIPriority="99" w:defSemiHidden="0" w:defUnhideWhenUsed="0" w:defQFormat="0" w:count="371">
-    <w:lsdException w:name="Normal" w:uiPriority="0" w:qFormat="1"/>
-    <w:lsdException w:name="heading 1" w:uiPriority="9" w:qFormat="1"/>
-    <w:lsdException w:name="heading 2" w:semiHidden="1" w:uiPriority="9" w:unhideWhenUsed="1" w:qFormat="1"/>
-    <w:lsdException w:name="heading 3" w:semiHidden="1" w:uiPriority="9" w:unhideWhenUsed="1" w:qFormat="1"/>
-    <w:lsdException w:name="heading 4" w:semiHidden="1" w:uiPriority="9" w:unhideWhenUsed="1" w:qFormat="1"/>
-    <w:lsdException w:name="heading 5" w:semiHidden="1" w:uiPriority="9" w:unhideWhenUsed="1" w:qFormat="1"/>
-    <w:lsdException w:name="heading 6" w:semiHidden="1" w:uiPriority="9" w:unhideWhenUsed="1" w:qFormat="1"/>
-    <w:lsdException w:name="heading 7" w:semiHidden="1" w:uiPriority="9" w:unhideWhenUsed="1" w:qFormat="1"/>
-    <w:lsdException w:name="heading 8" w:semiHidden="1" w:uiPriority="9" w:unhideWhenUsed="1" w:qFormat="1"/>
-    <w:lsdException w:name="heading 9" w:semiHidden="1" w:uiPriority="9" w:unhideWhenUsed="1" w:qFormat="1"/>
-    <w:lsdException w:name="index 1" w:semiHidden="1" w:unhideWhenUsed="1"/>
-    <w:lsdException w:name="index 2" w:semiHidden="1" w:unhideWhenUsed="1"/>
-    <w:lsdException w:name="index 3" w:semiHidden="1" w:unhideWhenUsed="1"/>
-    <w:lsdException w:name="index 4" w:semiHidden="1" w:unhideWhenUsed="1"/>
-    <w:lsdException w:name="index 5" w:semiHidden="1" w:unhideWhenUsed="1"/>
-    <w:lsdException w:name="index 6" w:semiHidden="1" w:unhideWhenUsed="1"/>
-    <w:lsdException w:name="index 7" w:semiHidden="1" w:unhideWhenUsed="1"/>
-    <w:lsdException w:name="index 8" w:semiHidden="1" w:unhideWhenUsed="1"/>
-    <w:lsdException w:name="index 9" w:semiHidden="1" w:unhideWhenUsed="1"/>
-    <w:lsdException w:name="toc 1" w:semiHidden="1" w:uiPriority="39" w:unhideWhenUsed="1"/>
-    <w:lsdException w:name="toc 2" w:semiHidden="1" w:uiPriority="39" w:unhideWhenUsed="1"/>
-    <w:lsdException w:name="toc 3" w:semiHidden="1" w:uiPriority="39" w:unhideWhenUsed="1"/>
-    <w:lsdException w:name="toc 4" w:semiHidden="1" w:uiPriority="39" w:unhideWhenUsed="1"/>
-    <w:lsdException w:name="toc 5" w:semiHidden="1" w:uiPriority="39" w:unhideWhenUsed="1"/>
-    <w:lsdException w:name="toc 6" w:semiHidden="1" w:uiPriority="39" w:unhideWhenUsed="1"/>
-    <w:lsdException w:name="toc 7" w:semiHidden="1" w:uiPriority="39" w:unhideWhenUsed="1"/>
-    <w:lsdException w:name="toc 8" w:semiHidden="1" w:uiPriority="39" w:unhideWhenUsed="1"/>
-    <w:lsdException w:name="toc 9" w:semiHidden="1" w:uiPriority="39" w:unhideWhenUsed="1"/>
-    <w:lsdException w:name="Normal Indent" w:semiHidden="1" w:unhideWhenUsed="1"/>
-    <w:lsdException w:name="footnote text" w:semiHidden="1" w:unhideWhenUsed="1"/>
-    <w:lsdException w:name="annotation text" w:semiHidden="1" w:unhideWhenUsed="1"/>
-    <w:lsdException w:name="header" w:semiHidden="1" w:unhideWhenUsed="1"/>
-    <w:lsdException w:name="footer" w:semiHidden="1" w:unhideWhenUsed="1"/>
-    <w:lsdException w:name="index heading" w:semiHidden="1" w:unhideWhenUsed="1"/>
-    <w:lsdException w:name="caption" w:semiHidden="1" w:uiPriority="35" w:unhideWhenUsed="1" w:qFormat="1"/>
-    <w:lsdException w:name="table of figures" w:semiHidden="1" w:unhideWhenUsed="1"/>
-    <w:lsdException w:name="envelope address" w:semiHidden="1" w:unhideWhenUsed="1"/>
-    <w:lsdException w:name="envelope return" w:semiHidden="1" w:unhideWhenUsed="1"/>
-    <w:lsdException w:name="footnote reference" w:semiHidden="1" w:unhideWhenUsed="1"/>
-    <w:lsdException w:name="annotation reference" w:semiHidden="1" w:unhideWhenUsed="1"/>
-    <w:lsdException w:name="line number" w:semiHidden="1" w:unhideWhenUsed="1"/>
-    <w:lsdException w:name="page number" w:semiHidden="1" w:unhideWhenUsed="1"/>
-    <w:lsdException w:name="endnote reference" w:semiHidden="1" w:unhideWhenUsed="1"/>
-    <w:lsdException w:name="endnote text" w:semiHidden="1" w:unhideWhenUsed="1"/>
-    <w:lsdException w:name="table of authorities" w:semiHidden="1" w:unhideWhenUsed="1"/>
-    <w:lsdException w:name="macro" w:semiHidden="1" w:unhideWhenUsed="1"/>
-    <w:lsdException w:name="toa heading" w:semiHidden="1" w:unhideWhenUsed="1"/>
-    <w:lsdException w:name="List" w:semiHidden="1" w:unhideWhenUsed="1"/>
-    <w:lsdException w:name="List Bullet" w:semiHidden="1" w:unhideWhenUsed="1"/>
-    <w:lsdException w:name="List Number" w:semiHidden="1" w:unhideWhenUsed="1"/>
-    <w:lsdException w:name="List 2" w:semiHidden="1" w:unhideWhenUsed="1"/>
-    <w:lsdException w:name="List 3" w:semiHidden="1" w:unhideWhenUsed="1"/>
-    <w:lsdException w:name="List 4" w:semiHidden="1" w:unhideWhenUsed="1"/>
-    <w:lsdException w:name="List 5" w:semiHidden="1" w:unhideWhenUsed="1"/>
-    <w:lsdException w:name="List Bullet 2" w:semiHidden="1" w:unhideWhenUsed="1"/>
-    <w:lsdException w:name="List Bullet 3" w:semiHidden="1" w:unhideWhenUsed="1"/>
-    <w:lsdException w:name="List Bullet 4" w:semiHidden="1" w:unhideWhenUsed="1"/>
-    <w:lsdException w:name="List Bullet 5" w:semiHidden="1" w:unhideWhenUsed="1"/>
-    <w:lsdException w:name="List Number 2" w:semiHidden="1" w:unhideWhenUsed="1"/>
-    <w:lsdException w:name="List Number 3" w:semiHidden="1" w:unhideWhenUsed="1"/>
-    <w:lsdException w:name="List Number 4" w:semiHidden="1" w:unhideWhenUsed="1"/>
-    <w:lsdException w:name="List Number 5" w:semiHidden="1" w:unhideWhenUsed="1"/>
-    <w:lsdException w:name="Title" w:uiPriority="10" w:qFormat="1"/>
-    <w:lsdException w:name="Closing" w:semiHidden="1" w:unhideWhenUsed="1"/>
-    <w:lsdException w:name="Signature" w:semiHidden="1" w:unhideWhenUsed="1"/>
-    <w:lsdException w:name="Default Paragraph Font" w:semiHidden="1" w:uiPriority="1" w:unhideWhenUsed="1"/>
-    <w:lsdException w:name="Body Text" w:semiHidden="1" w:unhideWhenUsed="1"/>
-    <w:lsdException w:name="Body Text Indent" w:semiHidden="1" w:unhideWhenUsed="1"/>
-    <w:lsdException w:name="List Continue" w:semiHidden="1" w:unhideWhenUsed="1"/>
-    <w:lsdException w:name="List Continue 2" w:semiHidden="1" w:unhideWhenUsed="1"/>
-    <w:lsdException w:name="List Continue 3" w:semiHidden="1" w:unhideWhenUsed="1"/>
-    <w:lsdException w:name="List Continue 4" w:semiHidden="1" w:unhideWhenUsed="1"/>
-    <w:lsdException w:name="List Continue 5" w:semiHidden="1" w:unhideWhenUsed="1"/>
-    <w:lsdException w:name="Message Header" w:semiHidden="1" w:unhideWhenUsed="1"/>
-    <w:lsdException w:name="Subtitle" w:uiPriority="11" w:qFormat="1"/>
-    <w:lsdException w:name="Salutation" w:semiHidden="1" w:unhideWhenUsed="1"/>
-    <w:lsdException w:name="Date" w:semiHidden="1" w:unhideWhenUsed="1"/>
-    <w:lsdException w:name="Body Text First Indent" w:semiHidden="1" w:unhideWhenUsed="1"/>
-    <w:lsdException w:name="Body Text First Indent 2" w:semiHidden="1" w:unhideWhenUsed="1"/>
-    <w:lsdException w:name="Note Heading" w:semiHidden="1" w:unhideWhenUsed="1"/>
-    <w:lsdException w:name="Body Text 2" w:semiHidden="1" w:unhideWhenUsed="1"/>
-    <w:lsdException w:name="Body Text 3" w:semiHidden="1" w:unhideWhenUsed="1"/>
-    <w:lsdException w:name="Body Text Indent 2" w:semiHidden="1" w:unhideWhenUsed="1"/>
-    <w:lsdException w:name="Body Text Indent 3" w:semiHidden="1" w:unhideWhenUsed="1"/>
-    <w:lsdException w:name="Block Text" w:semiHidden="1" w:unhideWhenUsed="1"/>
-    <w:lsdException w:name="Hyperlink" w:semiHidden="1" w:unhideWhenUsed="1"/>
-    <w:lsdException w:name="FollowedHyperlink" w:semiHidden="1" w:unhideWhenUsed="1"/>
-    <w:lsdException w:name="Strong" w:uiPriority="22" w:qFormat="1"/>
-    <w:lsdException w:name="Emphasis" w:uiPriority="20" w:qFormat="1"/>
-    <w:lsdException w:name="Document Map" w:semiHidden="1" w:unhideWhenUsed="1"/>
-    <w:lsdException w:name="Plain Text" w:semiHidden="1" w:unhideWhenUsed="1"/>
-    <w:lsdException w:name="E-mail Signature" w:semiHidden="1" w:unhideWhenUsed="1"/>
-    <w:lsdException w:name="HTML Top of Form" w:semiHidden="1" w:unhideWhenUsed="1"/>
-    <w:lsdException w:name="HTML Bottom of Form" w:semiHidden="1" w:unhideWhenUsed="1"/>
-    <w:lsdException w:name="Normal (Web)" w:semiHidden="1" w:unhideWhenUsed="1"/>
-    <w:lsdException w:name="HTML Acronym" w:semiHidden="1" w:unhideWhenUsed="1"/>
-    <w:lsdException w:name="HTML Address" w:semiHidden="1" w:unhideWhenUsed="1"/>
-    <w:lsdException w:name="HTML Cite" w:semiHidden="1" w:unhideWhenUsed="1"/>
-    <w:lsdException w:name="HTML Code" w:semiHidden="1" w:unhideWhenUsed="1"/>
-    <w:lsdException w:name="HTML Definition" w:semiHidden="1" w:unhideWhenUsed="1"/>
-    <w:lsdException w:name="HTML Keyboard" w:semiHidden="1" w:unhideWhenUsed="1"/>
-    <w:lsdException w:name="HTML Preformatted" w:semiHidden="1" w:unhideWhenUsed="1"/>
-    <w:lsdException w:name="HTML Sample" w:semiHidden="1" w:unhideWhenUsed="1"/>
-    <w:lsdException w:name="HTML Typewriter" w:semiHidden="1" w:unhideWhenUsed="1"/>
-    <w:lsdException w:name="HTML Variable" w:semiHidden="1" w:unhideWhenUsed="1"/>
-    <w:lsdException w:name="Normal Table" w:semiHidden="1" w:unhideWhenUsed="1"/>
-    <w:lsdException w:name="annotation subject" w:semiHidden="1" w:unhideWhenUsed="1"/>
-    <w:lsdException w:name="No List" w:semiHidden="1" w:unhideWhenUsed="1"/>
-    <w:lsdException w:name="Outline List 1" w:semiHidden="1" w:unhideWhenUsed="1"/>
-    <w:lsdException w:name="Outline List 2" w:semiHidden="1" w:unhideWhenUsed="1"/>
-    <w:lsdException w:name="Outline List 3" w:semiHidden="1" w:unhideWhenUsed="1"/>
-    <w:lsdException w:name="Table Simple 1" w:semiHidden="1" w:unhideWhenUsed="1"/>
-    <w:lsdException w:name="Table Simple 2" w:semiHidden="1" w:unhideWhenUsed="1"/>
-    <w:lsdException w:name="Table Simple 3" w:semiHidden="1" w:unhideWhenUsed="1"/>
-    <w:lsdException w:name="Table Classic 1" w:semiHidden="1" w:unhideWhenUsed="1"/>
-    <w:lsdException w:name="Table Classic 2" w:semiHidden="1" w:unhideWhenUsed="1"/>
-    <w:lsdException w:name="Table Classic 3" w:semiHidden="1" w:unhideWhenUsed="1"/>
-    <w:lsdException w:name="Table Classic 4" w:semiHidden="1" w:unhideWhenUsed="1"/>
-    <w:lsdException w:name="Table Colorful 1" w:semiHidden="1" w:unhideWhenUsed="1"/>
-    <w:lsdException w:name="Table Colorful 2" w:semiHidden="1" w:unhideWhenUsed="1"/>
-    <w:lsdException w:name="Table Colorful 3" w:semiHidden="1" w:unhideWhenUsed="1"/>
-    <w:lsdException w:name="Table Columns 1" w:semiHidden="1" w:unhideWhenUsed="1"/>
-    <w:lsdException w:name="Table Columns 2" w:semiHidden="1" w:unhideWhenUsed="1"/>
-    <w:lsdException w:name="Table Columns 3" w:semiHidden="1" w:unhideWhenUsed="1"/>
-    <w:lsdException w:name="Table Columns 4" w:semiHidden="1" w:unhideWhenUsed="1"/>
-    <w:lsdException w:name="Table Columns 5" w:semiHidden="1" w:unhideWhenUsed="1"/>
-    <w:lsdException w:name="Table Grid 1" w:semiHidden="1" w:unhideWhenUsed="1"/>
-    <w:lsdException w:name="Table Grid 2" w:semiHidden="1" w:unhideWhenUsed="1"/>
-    <w:lsdException w:name="Table Grid 3" w:semiHidden="1" w:unhideWhenUsed="1"/>
-    <w:lsdException w:name="Table Grid 4" w:semiHidden="1" w:unhideWhenUsed="1"/>
-    <w:lsdException w:name="Table Grid 5" w:semiHidden="1" w:unhideWhenUsed="1"/>
-    <w:lsdException w:name="Table Grid 6" w:semiHidden="1" w:unhideWhenUsed="1"/>
-    <w:lsdException w:name="Table Grid 7" w:semiHidden="1" w:unhideWhenUsed="1"/>
-    <w:lsdException w:name="Table Grid 8" w:semiHidden="1" w:unhideWhenUsed="1"/>
-    <w:lsdException w:name="Table List 1" w:semiHidden="1" w:unhideWhenUsed="1"/>
-    <w:lsdException w:name="Table List 2" w:semiHidden="1" w:unhideWhenUsed="1"/>
-    <w:lsdException w:name="Table List 3" w:semiHidden="1" w:unhideWhenUsed="1"/>
-    <w:lsdException w:name="Table List 4" w:semiHidden="1" w:unhideWhenUsed="1"/>
-    <w:lsdException w:name="Table List 5" w:semiHidden="1" w:unhideWhenUsed="1"/>
-    <w:lsdException w:name="Table List 6" w:semiHidden="1" w:unhideWhenUsed="1"/>
-    <w:lsdException w:name="Table List 7" w:semiHidden="1" w:unhideWhenUsed="1"/>
-    <w:lsdException w:name="Table List 8" w:semiHidden="1" w:unhideWhenUsed="1"/>
-    <w:lsdException w:name="Table 3D effects 1" w:semiHidden="1" w:unhideWhenUsed="1"/>
-    <w:lsdException w:name="Table 3D effects 2" w:semiHidden="1" w:unhideWhenUsed="1"/>
-    <w:lsdException w:name="Table 3D effects 3" w:semiHidden="1" w:unhideWhenUsed="1"/>
-    <w:lsdException w:name="Table Contemporary" w:semiHidden="1" w:unhideWhenUsed="1"/>
-    <w:lsdException w:name="Table Elegant" w:semiHidden="1" w:unhideWhenUsed="1"/>
-    <w:lsdException w:name="Table Professional" w:semiHidden="1" w:unhideWhenUsed="1"/>
-    <w:lsdException w:name="Table Subtle 1" w:semiHidden="1" w:unhideWhenUsed="1"/>
-    <w:lsdException w:name="Table Subtle 2" w:semiHidden="1" w:unhideWhenUsed="1"/>
-    <w:lsdException w:name="Table Web 1" w:semiHidden="1" w:unhideWhenUsed="1"/>
-    <w:lsdException w:name="Table Web 2" w:semiHidden="1" w:unhideWhenUsed="1"/>
-    <w:lsdException w:name="Table Web 3" w:semiHidden="1" w:unhideWhenUsed="1"/>
-    <w:lsdException w:name="Balloon Text" w:semiHidden="1" w:unhideWhenUsed="1"/>
-    <w:lsdException w:name="Table Grid" w:uiPriority="59"/>
-    <w:lsdException w:name="Table Theme" w:semiHidden="1" w:unhideWhenUsed="1"/>
-    <w:lsdException w:name="Placeholder Text" w:semiHidden="1"/>
-    <w:lsdException w:name="No Spacing" w:uiPriority="1" w:qFormat="1"/>
-    <w:lsdException w:name="Light Shading" w:uiPriority="60"/>
-    <w:lsdException w:name="Light List" w:uiPriority="61"/>
-    <w:lsdException w:name="Light Grid" w:uiPriority="62"/>
-    <w:lsdException w:name="Medium Shading 1" w:uiPriority="63"/>
-    <w:lsdException w:name="Medium Shading 2" w:uiPriority="64"/>
-    <w:lsdException w:name="Medium List 1" w:uiPriority="65"/>
-    <w:lsdException w:name="Medium List 2" w:uiPriority="66"/>
-    <w:lsdException w:name="Medium Grid 1" w:uiPriority="67"/>
-    <w:lsdException w:name="Medium Grid 2" w:uiPriority="68"/>
-    <w:lsdException w:name="Medium Grid 3" w:uiPriority="69"/>
-    <w:lsdException w:name="Dark List" w:uiPriority="70"/>
-    <w:lsdException w:name="Colorful Shading" w:uiPriority="71"/>
-    <w:lsdException w:name="Colorful List" w:uiPriority="72"/>
-    <w:lsdException w:name="Colorful Grid" w:uiPriority="73"/>
-    <w:lsdException w:name="Light Shading Accent 1" w:uiPriority="60"/>
-    <w:lsdException w:name="Light List Accent 1" w:uiPriority="61"/>
-    <w:lsdException w:name="Light Grid Accent 1" w:uiPriority="62"/>
-    <w:lsdException w:name="Medium Shading 1 Accent 1" w:uiPriority="63"/>
-    <w:lsdException w:name="Medium Shading 2 Accent 1" w:uiPriority="64"/>
-    <w:lsdException w:name="Medium List 1 Accent 1" w:uiPriority="65"/>
-    <w:lsdException w:name="Revision" w:semiHidden="1"/>
-    <w:lsdException w:name="List Paragraph" w:uiPriority="34" w:qFormat="1"/>
-    <w:lsdException w:name="Quote" w:uiPriority="29" w:qFormat="1"/>
-    <w:lsdException w:name="Intense Quote" w:uiPriority="30" w:qFormat="1"/>
-    <w:lsdException w:name="Medium List 2 Accent 1" w:uiPriority="66"/>
-    <w:lsdException w:name="Medium Grid 1 Accent 1" w:uiPriority="67"/>
-    <w:lsdException w:name="Medium Grid 2 Accent 1" w:uiPriority="68"/>
-    <w:lsdException w:name="Medium Grid 3 Accent 1" w:uiPriority="69"/>
-    <w:lsdException w:name="Dark List Accent 1" w:uiPriority="70"/>
-    <w:lsdException w:name="Colorful Shading Accent 1" w:uiPriority="71"/>
-    <w:lsdException w:name="Colorful List Accent 1" w:uiPriority="72"/>
-    <w:lsdException w:name="Colorful Grid Accent 1" w:uiPriority="73"/>
-    <w:lsdException w:name="Light Shading Accent 2" w:uiPriority="60"/>
-    <w:lsdException w:name="Light List Accent 2" w:uiPriority="61"/>
-    <w:lsdException w:name="Light Grid Accent 2" w:uiPriority="62"/>
-    <w:lsdException w:name="Medium Shading 1 Accent 2" w:uiPriority="63"/>
-    <w:lsdException w:name="Medium Shading 2 Accent 2" w:uiPriority="64"/>
-    <w:lsdException w:name="Medium List 1 Accent 2" w:uiPriority="65"/>
-    <w:lsdException w:name="Medium List 2 Accent 2" w:uiPriority="66"/>
-    <w:lsdException w:name="Medium Grid 1 Accent 2" w:uiPriority="67"/>
-    <w:lsdException w:name="Medium Grid 2 Accent 2" w:uiPriority="68"/>
-    <w:lsdException w:name="Medium Grid 3 Accent 2" w:uiPriority="69"/>
-    <w:lsdException w:name="Dark List Accent 2" w:uiPriority="70"/>
-    <w:lsdException w:name="Colorful Shading Accent 2" w:uiPriority="71"/>
-    <w:lsdException w:name="Colorful List Accent 2" w:uiPriority="72"/>
-    <w:lsdException w:name="Colorful Grid Accent 2" w:uiPriority="73"/>
-    <w:lsdException w:name="Light Shading Accent 3" w:uiPriority="60"/>
-    <w:lsdException w:name="Light List Accent 3" w:uiPriority="61"/>
-    <w:lsdException w:name="Light Grid Accent 3" w:uiPriority="62"/>
-    <w:lsdException w:name="Medium Shading 1 Accent 3" w:uiPriority="63"/>
-    <w:lsdException w:name="Medium Shading 2 Accent 3" w:uiPriority="64"/>
-    <w:lsdException w:name="Medium List 1 Accent 3" w:uiPriority="65"/>
-    <w:lsdException w:name="Medium List 2 Accent 3" w:uiPriority="66"/>
-    <w:lsdException w:name="Medium Grid 1 Accent 3" w:uiPriority="67"/>
-    <w:lsdException w:name="Medium Grid 2 Accent 3" w:uiPriority="68"/>
-    <w:lsdException w:name="Medium Grid 3 Accent 3" w:uiPriority="69"/>
-    <w:lsdException w:name="Dark List Accent 3" w:uiPriority="70"/>
-    <w:lsdException w:name="Colorful Shading Accent 3" w:uiPriority="71"/>
-    <w:lsdException w:name="Colorful List Accent 3" w:uiPriority="72"/>
-    <w:lsdException w:name="Colorful Grid Accent 3" w:uiPriority="73"/>
-    <w:lsdException w:name="Light Shading Accent 4" w:uiPriority="60"/>
-    <w:lsdException w:name="Light List Accent 4" w:uiPriority="61"/>
-    <w:lsdException w:name="Light Grid Accent 4" w:uiPriority="62"/>
-    <w:lsdException w:name="Medium Shading 1 Accent 4" w:uiPriority="63"/>
-    <w:lsdException w:name="Medium Shading 2 Accent 4" w:uiPriority="64"/>
-    <w:lsdException w:name="Medium List 1 Accent 4" w:uiPriority="65"/>
-    <w:lsdException w:name="Medium List 2 Accent 4" w:uiPriority="66"/>
-    <w:lsdException w:name="Medium Grid 1 Accent 4" w:uiPriority="67"/>
-    <w:lsdException w:name="Medium Grid 2 Accent 4" w:uiPriority="68"/>
-    <w:lsdException w:name="Medium Grid 3 Accent 4" w:uiPriority="69"/>
-    <w:lsdException w:name="Dark List Accent 4" w:uiPriority="70"/>
-    <w:lsdException w:name="Colorful Shading Accent 4" w:uiPriority="71"/>
-    <w:lsdException w:name="Colorful List Accent 4" w:uiPriority="72"/>
-    <w:lsdException w:name="Colorful Grid Accent 4" w:uiPriority="73"/>
-    <w:lsdException w:name="Light Shading Accent 5" w:uiPriority="60"/>
-    <w:lsdException w:name="Light List Accent 5" w:uiPriority="61"/>
-    <w:lsdException w:name="Light Grid Accent 5" w:uiPriority="62"/>
-    <w:lsdException w:name="Medium Shading 1 Accent 5" w:uiPriority="63"/>
-    <w:lsdException w:name="Medium Shading 2 Accent 5" w:uiPriority="64"/>
-    <w:lsdException w:name="Medium List 1 Accent 5" w:uiPriority="65"/>
-    <w:lsdException w:name="Medium List 2 Accent 5" w:uiPriority="66"/>
-    <w:lsdException w:name="Medium Grid 1 Accent 5" w:uiPriority="67"/>
-    <w:lsdException w:name="Medium Grid 2 Accent 5" w:uiPriority="68"/>
-    <w:lsdException w:name="Medium Grid 3 Accent 5" w:uiPriority="69"/>
-    <w:lsdException w:name="Dark List Accent 5" w:uiPriority="70"/>
-    <w:lsdException w:name="Colorful Shading Accent 5" w:uiPriority="71"/>
-    <w:lsdException w:name="Colorful List Accent 5" w:uiPriority="72"/>
-    <w:lsdException w:name="Colorful Grid Accent 5" w:uiPriority="73"/>
-    <w:lsdException w:name="Light Shading Accent 6" w:uiPriority="60"/>
-    <w:lsdException w:name="Light List Accent 6" w:uiPriority="61"/>
-    <w:lsdException w:name="Light Grid Accent 6" w:uiPriority="62"/>
-    <w:lsdException w:name="Medium Shading 1 Accent 6" w:uiPriority="63"/>
-    <w:lsdException w:name="Medium Shading 2 Accent 6" w:uiPriority="64"/>
-    <w:lsdException w:name="Medium List 1 Accent 6" w:uiPriority="65"/>
-    <w:lsdException w:name="Medium List 2 Accent 6" w:uiPriority="66"/>
-    <w:lsdException w:name="Medium Grid 1 Accent 6" w:uiPriority="67"/>
-    <w:lsdException w:name="Medium Grid 2 Accent 6" w:uiPriority="68"/>
-    <w:lsdException w:name="Medium Grid 3 Accent 6" w:uiPriority="69"/>
-    <w:lsdException w:name="Dark List Accent 6" w:uiPriority="70"/>
-    <w:lsdException w:name="Colorful Shading Accent 6" w:uiPriority="71"/>
-    <w:lsdException w:name="Colorful List Accent 6" w:uiPriority="72"/>
-    <w:lsdException w:name="Colorful Grid Accent 6" w:uiPriority="73"/>
-    <w:lsdException w:name="Subtle Emphasis" w:uiPriority="19" w:qFormat="1"/>
-    <w:lsdException w:name="Intense Emphasis" w:uiPriority="21" w:qFormat="1"/>
-    <w:lsdException w:name="Subtle Reference" w:uiPriority="31" w:qFormat="1"/>
-    <w:lsdException w:name="Intense Reference" w:uiPriority="32" w:qFormat="1"/>
-    <w:lsdException w:name="Book Title" w:uiPriority="33" w:qFormat="1"/>
-    <w:lsdException w:name="Bibliography" w:semiHidden="1" w:uiPriority="37" w:unhideWhenUsed="1"/>
-    <w:lsdException w:name="TOC Heading" w:semiHidden="1" w:uiPriority="39" w:unhideWhenUsed="1" w:qFormat="1"/>
-    <w:lsdException w:name="Plain Table 1" w:uiPriority="41"/>
-    <w:lsdException w:name="Plain Table 2" w:uiPriority="42"/>
-    <w:lsdException w:name="Plain Table 3" w:uiPriority="43"/>
-    <w:lsdException w:name="Plain Table 4" w:uiPriority="44"/>
-    <w:lsdException w:name="Plain Table 5" w:uiPriority="45"/>
-    <w:lsdException w:name="Grid Table Light" w:uiPriority="40"/>
-    <w:lsdException w:name="Grid Table 1 Light" w:uiPriority="46"/>
-    <w:lsdException w:name="Grid Table 2" w:uiPriority="47"/>
-    <w:lsdException w:name="Grid Table 3" w:uiPriority="48"/>
-    <w:lsdException w:name="Grid Table 4" w:uiPriority="49"/>
-    <w:lsdException w:name="Grid Table 5 Dark" w:uiPriority="50"/>
-    <w:lsdException w:name="Grid Table 6 Colorful" w:uiPriority="51"/>
-    <w:lsdException w:name="Grid Table 7 Colorful" w:uiPriority="52"/>
-    <w:lsdException w:name="Grid Table 1 Light Accent 1" w:uiPriority="46"/>
-    <w:lsdException w:name="Grid Table 2 Accent 1" w:uiPriority="47"/>
-    <w:lsdException w:name="Grid Table 3 Accent 1" w:uiPriority="48"/>
-    <w:lsdException w:name="Grid Table 4 Accent 1" w:uiPriority="49"/>
-    <w:lsdException w:name="Grid Table 5 Dark Accent 1" w:uiPriority="50"/>
-    <w:lsdException w:name="Grid Table 6 Colorful Accent 1" w:uiPriority="51"/>
-    <w:lsdException w:name="Grid Table 7 Colorful Accent 1" w:uiPriority="52"/>
-    <w:lsdException w:name="Grid Table 1 Light Accent 2" w:uiPriority="46"/>
-    <w:lsdException w:name="Grid Table 2 Accent 2" w:uiPriority="47"/>
-    <w:lsdException w:name="Grid Table 3 Accent 2" w:uiPriority="48"/>
-    <w:lsdException w:name="Grid Table 4 Accent 2" w:uiPriority="49"/>
-    <w:lsdException w:name="Grid Table 5 Dark Accent 2" w:uiPriority="50"/>
-    <w:lsdException w:name="Grid Table 6 Colorful Accent 2" w:uiPriority="51"/>
-    <w:lsdException w:name="Grid Table 7 Colorful Accent 2" w:uiPriority="52"/>
-    <w:lsdException w:name="Grid Table 1 Light Accent 3" w:uiPriority="46"/>
-    <w:lsdException w:name="Grid Table 2 Accent 3" w:uiPriority="47"/>
-    <w:lsdException w:name="Grid Table 3 Accent 3" w:uiPriority="48"/>
-    <w:lsdException w:name="Grid Table 4 Accent 3" w:uiPriority="49"/>
-    <w:lsdException w:name="Grid Table 5 Dark Accent 3" w:uiPriority="50"/>
-    <w:lsdException w:name="Grid Table 6 Colorful Accent 3" w:uiPriority="51"/>
-    <w:lsdException w:name="Grid Table 7 Colorful Accent 3" w:uiPriority="52"/>
-    <w:lsdException w:name="Grid Table 1 Light Accent 4" w:uiPriority="46"/>
-    <w:lsdException w:name="Grid Table 2 Accent 4" w:uiPriority="47"/>
-    <w:lsdException w:name="Grid Table 3 Accent 4" w:uiPriority="48"/>
-    <w:lsdException w:name="Grid Table 4 Accent 4" w:uiPriority="49"/>
-    <w:lsdException w:name="Grid Table 5 Dark Accent 4" w:uiPriority="50"/>
-    <w:lsdException w:name="Grid Table 6 Colorful Accent 4" w:uiPriority="51"/>
-    <w:lsdException w:name="Grid Table 7 Colorful Accent 4" w:uiPriority="52"/>
-    <w:lsdException w:name="Grid Table 1 Light Accent 5" w:uiPriority="46"/>
-    <w:lsdException w:name="Grid Table 2 Accent 5" w:uiPriority="47"/>
-    <w:lsdException w:name="Grid Table 3 Accent 5" w:uiPriority="48"/>
-    <w:lsdException w:name="Grid Table 4 Accent 5" w:uiPriority="49"/>
-    <w:lsdException w:name="Grid Table 5 Dark Accent 5" w:uiPriority="50"/>
-    <w:lsdException w:name="Grid Table 6 Colorful Accent 5" w:uiPriority="51"/>
-    <w:lsdException w:name="Grid Table 7 Colorful Accent 5" w:uiPriority="52"/>
-    <w:lsdException w:name="Grid Table 1 Light Accent 6" w:uiPriority="46"/>
-    <w:lsdException w:name="Grid Table 2 Accent 6" w:uiPriority="47"/>
-    <w:lsdException w:name="Grid Table 3 Accent 6" w:uiPriority="48"/>
-    <w:lsdException w:name="Grid Table 4 Accent 6" w:uiPriority="49"/>
-    <w:lsdException w:name="Grid Table 5 Dark Accent 6" w:uiPriority="50"/>
-    <w:lsdException w:name="Grid Table 6 Colorful Accent 6" w:uiPriority="51"/>
-    <w:lsdException w:name="Grid Table 7 Colorful Accent 6" w:uiPriority="52"/>
-    <w:lsdException w:name="List Table 1 Light" w:uiPriority="46"/>
-    <w:lsdException w:name="List Table 2" w:uiPriority="47"/>
-    <w:lsdException w:name="List Table 3" w:uiPriority="48"/>
-    <w:lsdException w:name="List Table 4" w:uiPriority="49"/>
-    <w:lsdException w:name="List Table 5 Dark" w:uiPriority="50"/>
-    <w:lsdException w:name="List Table 6 Colorful" w:uiPriority="51"/>
-    <w:lsdException w:name="List Table 7 Colorful" w:uiPriority="52"/>
-    <w:lsdException w:name="List Table 1 Light Accent 1" w:uiPriority="46"/>
-    <w:lsdException w:name="List Table 2 Accent 1" w:uiPriority="47"/>
-    <w:lsdException w:name="List Table 3 Accent 1" w:uiPriority="48"/>
-    <w:lsdException w:name="List Table 4 Accent 1" w:uiPriority="49"/>
-    <w:lsdException w:name="List Table 5 Dark Accent 1" w:uiPriority="50"/>
-    <w:lsdException w:name="List Table 6 Colorful Accent 1" w:uiPriority="51"/>
-    <w:lsdException w:name="List Table 7 Colorful Accent 1" w:uiPriority="52"/>
-    <w:lsdException w:name="List Table 1 Light Accent 2" w:uiPriority="46"/>
-    <w:lsdException w:name="List Table 2 Accent 2" w:uiPriority="47"/>
-    <w:lsdException w:name="List Table 3 Accent 2" w:uiPriority="48"/>
-    <w:lsdException w:name="List Table 4 Accent 2" w:uiPriority="49"/>
-    <w:lsdException w:name="List Table 5 Dark Accent 2" w:uiPriority="50"/>
-    <w:lsdException w:name="List Table 6 Colorful Accent 2" w:uiPriority="51"/>
-    <w:lsdException w:name="List Table 7 Colorful Accent 2" w:uiPriority="52"/>
-    <w:lsdException w:name="List Table 1 Light Accent 3" w:uiPriority="46"/>
-    <w:lsdException w:name="List Table 2 Accent 3" w:uiPriority="47"/>
-    <w:lsdException w:name="List Table 3 Accent 3" w:uiPriority="48"/>
-    <w:lsdException w:name="List Table 4 Accent 3" w:uiPriority="49"/>
-    <w:lsdException w:name="List Table 5 Dark Accent 3" w:uiPriority="50"/>
-    <w:lsdException w:name="List Table 6 Colorful Accent 3" w:uiPriority="51"/>
-    <w:lsdException w:name="List Table 7 Colorful Accent 3" w:uiPriority="52"/>
-    <w:lsdException w:name="List Table 1 Light Accent 4" w:uiPriority="46"/>
-    <w:lsdException w:name="List Table 2 Accent 4" w:uiPriority="47"/>
-    <w:lsdException w:name="List Table 3 Accent 4" w:uiPriority="48"/>
-    <w:lsdException w:name="List Table 4 Accent 4" w:uiPriority="49"/>
-    <w:lsdException w:name="List Table 5 Dark Accent 4" w:uiPriority="50"/>
-    <w:lsdException w:name="List Table 6 Colorful Accent 4" w:uiPriority="51"/>
-    <w:lsdException w:name="List Table 7 Colorful Accent 4" w:uiPriority="52"/>
-    <w:lsdException w:name="List Table 1 Light Accent 5" w:uiPriority="46"/>
-    <w:lsdException w:name="List Table 2 Accent 5" w:uiPriority="47"/>
-    <w:lsdException w:name="List Table 3 Accent 5" w:uiPriority="48"/>
-    <w:lsdException w:name="List Table 4 Accent 5" w:uiPriority="49"/>
-    <w:lsdException w:name="List Table 5 Dark Accent 5" w:uiPriority="50"/>
-    <w:lsdException w:name="List Table 6 Colorful Accent 5" w:uiPriority="51"/>
-    <w:lsdException w:name="List Table 7 Colorful Accent 5" w:uiPriority="52"/>
-    <w:lsdException w:name="List Table 1 Light Accent 6" w:uiPriority="46"/>
-    <w:lsdException w:name="List Table 2 Accent 6" w:uiPriority="47"/>
-    <w:lsdException w:name="List Table 3 Accent 6" w:uiPriority="48"/>
-    <w:lsdException w:name="List Table 4 Accent 6" w:uiPriority="49"/>
-    <w:lsdException w:name="List Table 5 Dark Accent 6" w:uiPriority="50"/>
-    <w:lsdException w:name="List Table 6 Colorful Accent 6" w:uiPriority="51"/>
-    <w:lsdException w:name="List Table 7 Colorful Accent 6" w:uiPriority="52"/>
+  <w:latentStyles w:defLockedState="0" w:defUIPriority="99" w:defSemiHidden="1" w:defUnhideWhenUsed="1" w:defQFormat="0" w:count="267">
+    <w:lsdException w:name="Normal" w:semiHidden="0" w:uiPriority="0" w:unhideWhenUsed="0" w:qFormat="1"/>
+    <w:lsdException w:name="heading 1" w:semiHidden="0" w:uiPriority="9" w:unhideWhenUsed="0" w:qFormat="1"/>
+    <w:lsdException w:name="heading 2" w:uiPriority="9" w:qFormat="1"/>
+    <w:lsdException w:name="heading 3" w:uiPriority="9" w:qFormat="1"/>
+    <w:lsdException w:name="heading 4" w:uiPriority="9" w:qFormat="1"/>
+    <w:lsdException w:name="heading 5" w:uiPriority="9" w:qFormat="1"/>
+    <w:lsdException w:name="heading 6" w:uiPriority="9" w:qFormat="1"/>
+    <w:lsdException w:name="heading 7" w:uiPriority="9" w:qFormat="1"/>
+    <w:lsdException w:name="heading 8" w:uiPriority="9" w:qFormat="1"/>
+    <w:lsdException w:name="heading 9" w:uiPriority="9" w:qFormat="1"/>
+    <w:lsdException w:name="toc 1" w:uiPriority="39"/>
+    <w:lsdException w:name="toc 2" w:uiPriority="39"/>
+    <w:lsdException w:name="toc 3" w:uiPriority="39"/>
+    <w:lsdException w:name="toc 4" w:uiPriority="39"/>
+    <w:lsdException w:name="toc 5" w:uiPriority="39"/>
+    <w:lsdException w:name="toc 6" w:uiPriority="39"/>
+    <w:lsdException w:name="toc 7" w:uiPriority="39"/>
+    <w:lsdException w:name="toc 8" w:uiPriority="39"/>
+    <w:lsdException w:name="toc 9" w:uiPriority="39"/>
+    <w:lsdException w:name="caption" w:uiPriority="35" w:qFormat="1"/>
+    <w:lsdException w:name="Title" w:semiHidden="0" w:uiPriority="10" w:unhideWhenUsed="0" w:qFormat="1"/>
+    <w:lsdException w:name="Default Paragraph Font" w:uiPriority="1"/>
+    <w:lsdException w:name="Subtitle" w:semiHidden="0" w:uiPriority="11" w:unhideWhenUsed="0" w:qFormat="1"/>
+    <w:lsdException w:name="Strong" w:semiHidden="0" w:uiPriority="22" w:unhideWhenUsed="0" w:qFormat="1"/>
+    <w:lsdException w:name="Emphasis" w:semiHidden="0" w:uiPriority="20" w:unhideWhenUsed="0" w:qFormat="1"/>
+    <w:lsdException w:name="Table Grid" w:semiHidden="0" w:uiPriority="59" w:unhideWhenUsed="0"/>
+    <w:lsdException w:name="Placeholder Text" w:unhideWhenUsed="0"/>
+    <w:lsdException w:name="No Spacing" w:semiHidden="0" w:uiPriority="1" w:unhideWhenUsed="0" w:qFormat="1"/>
+    <w:lsdException w:name="Light Shading" w:semiHidden="0" w:uiPriority="60" w:unhideWhenUsed="0"/>
+    <w:lsdException w:name="Light List" w:semiHidden="0" w:uiPriority="61" w:unhideWhenUsed="0"/>
+    <w:lsdException w:name="Light Grid" w:semiHidden="0" w:uiPriority="62" w:unhideWhenUsed="0"/>
+    <w:lsdException w:name="Medium Shading 1" w:semiHidden="0" w:uiPriority="63" w:unhideWhenUsed="0"/>
+    <w:lsdException w:name="Medium Shading 2" w:semiHidden="0" w:uiPriority="64" w:unhideWhenUsed="0"/>
+    <w:lsdException w:name="Medium List 1" w:semiHidden="0" w:uiPriority="65" w:unhideWhenUsed="0"/>
+    <w:lsdException w:name="Medium List 2" w:semiHidden="0" w:uiPriority="66" w:unhideWhenUsed="0"/>
+    <w:lsdException w:name="Medium Grid 1" w:semiHidden="0" w:uiPriority="67" w:unhideWhenUsed="0"/>
+    <w:lsdException w:name="Medium Grid 2" w:semiHidden="0" w:uiPriority="68" w:unhideWhenUsed="0"/>
+    <w:lsdException w:name="Medium Grid 3" w:semiHidden="0" w:uiPriority="69" w:unhideWhenUsed="0"/>
+    <w:lsdException w:name="Dark List" w:semiHidden="0" w:uiPriority="70" w:unhideWhenUsed="0"/>
+    <w:lsdException w:name="Colorful Shading" w:semiHidden="0" w:uiPriority="71" w:unhideWhenUsed="0"/>
+    <w:lsdException w:name="Colorful List" w:semiHidden="0" w:uiPriority="72" w:unhideWhenUsed="0"/>
+    <w:lsdException w:name="Colorful Grid" w:semiHidden="0" w:uiPriority="73" w:unhideWhenUsed="0"/>
+    <w:lsdException w:name="Light Shading Accent 1" w:semiHidden="0" w:uiPriority="60" w:unhideWhenUsed="0"/>
+    <w:lsdException w:name="Light List Accent 1" w:semiHidden="0" w:uiPriority="61" w:unhideWhenUsed="0"/>
+    <w:lsdException w:name="Light Grid Accent 1" w:semiHidden="0" w:uiPriority="62" w:unhideWhenUsed="0"/>
+    <w:lsdException w:name="Medium Shading 1 Accent 1" w:semiHidden="0" w:uiPriority="63" w:unhideWhenUsed="0"/>
+    <w:lsdException w:name="Medium Shading 2 Accent 1" w:semiHidden="0" w:uiPriority="64" w:unhideWhenUsed="0"/>
+    <w:lsdException w:name="Medium List 1 Accent 1" w:semiHidden="0" w:uiPriority="65" w:unhideWhenUsed="0"/>
+    <w:lsdException w:name="Revision" w:unhideWhenUsed="0"/>
+    <w:lsdException w:name="List Paragraph" w:semiHidden="0" w:uiPriority="34" w:unhideWhenUsed="0" w:qFormat="1"/>
+    <w:lsdException w:name="Quote" w:semiHidden="0" w:uiPriority="29" w:unhideWhenUsed="0" w:qFormat="1"/>
+    <w:lsdException w:name="Intense Quote" w:semiHidden="0" w:uiPriority="30" w:unhideWhenUsed="0" w:qFormat="1"/>
+    <w:lsdException w:name="Medium List 2 Accent 1" w:semiHidden="0" w:uiPriority="66" w:unhideWhenUsed="0"/>
+    <w:lsdException w:name="Medium Grid 1 Accent 1" w:semiHidden="0" w:uiPriority="67" w:unhideWhenUsed="0"/>
+    <w:lsdException w:name="Medium Grid 2 Accent 1" w:semiHidden="0" w:uiPriority="68" w:unhideWhenUsed="0"/>
+    <w:lsdException w:name="Medium Grid 3 Accent 1" w:semiHidden="0" w:uiPriority="69" w:unhideWhenUsed="0"/>
+    <w:lsdException w:name="Dark List Accent 1" w:semiHidden="0" w:uiPriority="70" w:unhideWhenUsed="0"/>
+    <w:lsdException w:name="Colorful Shading Accent 1" w:semiHidden="0" w:uiPriority="71" w:unhideWhenUsed="0"/>
+    <w:lsdException w:name="Colorful List Accent 1" w:semiHidden="0" w:uiPriority="72" w:unhideWhenUsed="0"/>
+    <w:lsdException w:name="Colorful Grid Accent 1" w:semiHidden="0" w:uiPriority="73" w:unhideWhenUsed="0"/>
+    <w:lsdException w:name="Light Shading Accent 2" w:semiHidden="0" w:uiPriority="60" w:unhideWhenUsed="0"/>
+    <w:lsdException w:name="Light List Accent 2" w:semiHidden="0" w:uiPriority="61" w:unhideWhenUsed="0"/>
+    <w:lsdException w:name="Light Grid Accent 2" w:semiHidden="0" w:uiPriority="62" w:unhideWhenUsed="0"/>
+    <w:lsdException w:name="Medium Shading 1 Accent 2" w:semiHidden="0" w:uiPriority="63" w:unhideWhenUsed="0"/>
+    <w:lsdException w:name="Medium Shading 2 Accent 2" w:semiHidden="0" w:uiPriority="64" w:unhideWhenUsed="0"/>
+    <w:lsdException w:name="Medium List 1 Accent 2" w:semiHidden="0" w:uiPriority="65" w:unhideWhenUsed="0"/>
+    <w:lsdException w:name="Medium List 2 Accent 2" w:semiHidden="0" w:uiPriority="66" w:unhideWhenUsed="0"/>
+    <w:lsdException w:name="Medium Grid 1 Accent 2" w:semiHidden="0" w:uiPriority="67" w:unhideWhenUsed="0"/>
+    <w:lsdException w:name="Medium Grid 2 Accent 2" w:semiHidden="0" w:uiPriority="68" w:unhideWhenUsed="0"/>
+    <w:lsdException w:name="Medium Grid 3 Accent 2" w:semiHidden="0" w:uiPriority="69" w:unhideWhenUsed="0"/>
+    <w:lsdException w:name="Dark List Accent 2" w:semiHidden="0" w:uiPriority="70" w:unhideWhenUsed="0"/>
+    <w:lsdException w:name="Colorful Shading Accent 2" w:semiHidden="0" w:uiPriority="71" w:unhideWhenUsed="0"/>
+    <w:lsdException w:name="Colorful List Accent 2" w:semiHidden="0" w:uiPriority="72" w:unhideWhenUsed="0"/>
+    <w:lsdException w:name="Colorful Grid Accent 2" w:semiHidden="0" w:uiPriority="73" w:unhideWhenUsed="0"/>
+    <w:lsdException w:name="Light Shading Accent 3" w:semiHidden="0" w:uiPriority="60" w:unhideWhenUsed="0"/>
+    <w:lsdException w:name="Light List Accent 3" w:semiHidden="0" w:uiPriority="61" w:unhideWhenUsed="0"/>
+    <w:lsdException w:name="Light Grid Accent 3" w:semiHidden="0" w:uiPriority="62" w:unhideWhenUsed="0"/>
+    <w:lsdException w:name="Medium Shading 1 Accent 3" w:semiHidden="0" w:uiPriority="63" w:unhideWhenUsed="0"/>
+    <w:lsdException w:name="Medium Shading 2 Accent 3" w:semiHidden="0" w:uiPriority="64" w:unhideWhenUsed="0"/>
+    <w:lsdException w:name="Medium List 1 Accent 3" w:semiHidden="0" w:uiPriority="65" w:unhideWhenUsed="0"/>
+    <w:lsdException w:name="Medium List 2 Accent 3" w:semiHidden="0" w:uiPriority="66" w:unhideWhenUsed="0"/>
+    <w:lsdException w:name="Medium Grid 1 Accent 3" w:semiHidden="0" w:uiPriority="67" w:unhideWhenUsed="0"/>
+    <w:lsdException w:name="Medium Grid 2 Accent 3" w:semiHidden="0" w:uiPriority="68" w:unhideWhenUsed="0"/>
+    <w:lsdException w:name="Medium Grid 3 Accent 3" w:semiHidden="0" w:uiPriority="69" w:unhideWhenUsed="0"/>
+    <w:lsdException w:name="Dark List Accent 3" w:semiHidden="0" w:uiPriority="70" w:unhideWhenUsed="0"/>
+    <w:lsdException w:name="Colorful Shading Accent 3" w:semiHidden="0" w:uiPriority="71" w:unhideWhenUsed="0"/>
+    <w:lsdException w:name="Colorful List Accent 3" w:semiHidden="0" w:uiPriority="72" w:unhideWhenUsed="0"/>
+    <w:lsdException w:name="Colorful Grid Accent 3" w:semiHidden="0" w:uiPriority="73" w:unhideWhenUsed="0"/>
+    <w:lsdException w:name="Light Shading Accent 4" w:semiHidden="0" w:uiPriority="60" w:unhideWhenUsed="0"/>
+    <w:lsdException w:name="Light List Accent 4" w:semiHidden="0" w:uiPriority="61" w:unhideWhenUsed="0"/>
+    <w:lsdException w:name="Light Grid Accent 4" w:semiHidden="0" w:uiPriority="62" w:unhideWhenUsed="0"/>
+    <w:lsdException w:name="Medium Shading 1 Accent 4" w:semiHidden="0" w:uiPriority="63" w:unhideWhenUsed="0"/>
+    <w:lsdException w:name="Medium Shading 2 Accent 4" w:semiHidden="0" w:uiPriority="64" w:unhideWhenUsed="0"/>
+    <w:lsdException w:name="Medium List 1 Accent 4" w:semiHidden="0" w:uiPriority="65" w:unhideWhenUsed="0"/>
+    <w:lsdException w:name="Medium List 2 Accent 4" w:semiHidden="0" w:uiPriority="66" w:unhideWhenUsed="0"/>
+    <w:lsdException w:name="Medium Grid 1 Accent 4" w:semiHidden="0" w:uiPriority="67" w:unhideWhenUsed="0"/>
+    <w:lsdException w:name="Medium Grid 2 Accent 4" w:semiHidden="0" w:uiPriority="68" w:unhideWhenUsed="0"/>
+    <w:lsdException w:name="Medium Grid 3 Accent 4" w:semiHidden="0" w:uiPriority="69" w:unhideWhenUsed="0"/>
+    <w:lsdException w:name="Dark List Accent 4" w:semiHidden="0" w:uiPriority="70" w:unhideWhenUsed="0"/>
+    <w:lsdException w:name="Colorful Shading Accent 4" w:semiHidden="0" w:uiPriority="71" w:unhideWhenUsed="0"/>
+    <w:lsdException w:name="Colorful List Accent 4" w:semiHidden="0" w:uiPriority="72" w:unhideWhenUsed="0"/>
+    <w:lsdException w:name="Colorful Grid Accent 4" w:semiHidden="0" w:uiPriority="73" w:unhideWhenUsed="0"/>
+    <w:lsdException w:name="Light Shading Accent 5" w:semiHidden="0" w:uiPriority="60" w:unhideWhenUsed="0"/>
+    <w:lsdException w:name="Light List Accent 5" w:semiHidden="0" w:uiPriority="61" w:unhideWhenUsed="0"/>
+    <w:lsdException w:name="Light Grid Accent 5" w:semiHidden="0" w:uiPriority="62" w:unhideWhenUsed="0"/>
+    <w:lsdException w:name="Medium Shading 1 Accent 5" w:semiHidden="0" w:uiPriority="63" w:unhideWhenUsed="0"/>
+    <w:lsdException w:name="Medium Shading 2 Accent 5" w:semiHidden="0" w:uiPriority="64" w:unhideWhenUsed="0"/>
+    <w:lsdException w:name="Medium List 1 Accent 5" w:semiHidden="0" w:uiPriority="65" w:unhideWhenUsed="0"/>
+    <w:lsdException w:name="Medium List 2 Accent 5" w:semiHidden="0" w:uiPriority="66" w:unhideWhenUsed="0"/>
+    <w:lsdException w:name="Medium Grid 1 Accent 5" w:semiHidden="0" w:uiPriority="67" w:unhideWhenUsed="0"/>
+    <w:lsdException w:name="Medium Grid 2 Accent 5" w:semiHidden="0" w:uiPriority="68" w:unhideWhenUsed="0"/>
+    <w:lsdException w:name="Medium Grid 3 Accent 5" w:semiHidden="0" w:uiPriority="69" w:unhideWhenUsed="0"/>
+    <w:lsdException w:name="Dark List Accent 5" w:semiHidden="0" w:uiPriority="70" w:unhideWhenUsed="0"/>
+    <w:lsdException w:name="Colorful Shading Accent 5" w:semiHidden="0" w:uiPriority="71" w:unhideWhenUsed="0"/>
+    <w:lsdException w:name="Colorful List Accent 5" w:semiHidden="0" w:uiPriority="72" w:unhideWhenUsed="0"/>
+    <w:lsdException w:name="Colorful Grid Accent 5" w:semiHidden="0" w:uiPriority="73" w:unhideWhenUsed="0"/>
+    <w:lsdException w:name="Light Shading Accent 6" w:semiHidden="0" w:uiPriority="60" w:unhideWhenUsed="0"/>
+    <w:lsdException w:name="Light List Accent 6" w:semiHidden="0" w:uiPriority="61" w:unhideWhenUsed="0"/>
+    <w:lsdException w:name="Light Grid Accent 6" w:semiHidden="0" w:uiPriority="62" w:unhideWhenUsed="0"/>
+    <w:lsdException w:name="Medium Shading 1 Accent 6" w:semiHidden="0" w:uiPriority="63" w:unhideWhenUsed="0"/>
+    <w:lsdException w:name="Medium Shading 2 Accent 6" w:semiHidden="0" w:uiPriority="64" w:unhideWhenUsed="0"/>
+    <w:lsdException w:name="Medium List 1 Accent 6" w:semiHidden="0" w:uiPriority="65" w:unhideWhenUsed="0"/>
+    <w:lsdException w:name="Medium List 2 Accent 6" w:semiHidden="0" w:uiPriority="66" w:unhideWhenUsed="0"/>
+    <w:lsdException w:name="Medium Grid 1 Accent 6" w:semiHidden="0" w:uiPriority="67" w:unhideWhenUsed="0"/>
+    <w:lsdException w:name="Medium Grid 2 Accent 6" w:semiHidden="0" w:uiPriority="68" w:unhideWhenUsed="0"/>
+    <w:lsdException w:name="Medium Grid 3 Accent 6" w:semiHidden="0" w:uiPriority="69" w:unhideWhenUsed="0"/>
+    <w:lsdException w:name="Dark List Accent 6" w:semiHidden="0" w:uiPriority="70" w:unhideWhenUsed="0"/>
+    <w:lsdException w:name="Colorful Shading Accent 6" w:semiHidden="0" w:uiPriority="71" w:unhideWhenUsed="0"/>
+    <w:lsdException w:name="Colorful List Accent 6" w:semiHidden="0" w:uiPriority="72" w:unhideWhenUsed="0"/>
+    <w:lsdException w:name="Colorful Grid Accent 6" w:semiHidden="0" w:uiPriority="73" w:unhideWhenUsed="0"/>
+    <w:lsdException w:name="Subtle Emphasis" w:semiHidden="0" w:uiPriority="19" w:unhideWhenUsed="0" w:qFormat="1"/>
+    <w:lsdException w:name="Intense Emphasis" w:semiHidden="0" w:uiPriority="21" w:unhideWhenUsed="0" w:qFormat="1"/>
+    <w:lsdException w:name="Subtle Reference" w:semiHidden="0" w:uiPriority="31" w:unhideWhenUsed="0" w:qFormat="1"/>
+    <w:lsdException w:name="Intense Reference" w:semiHidden="0" w:uiPriority="32" w:unhideWhenUsed="0" w:qFormat="1"/>
+    <w:lsdException w:name="Book Title" w:semiHidden="0" w:uiPriority="33" w:unhideWhenUsed="0" w:qFormat="1"/>
+    <w:lsdException w:name="Bibliography" w:uiPriority="37"/>
+    <w:lsdException w:name="TOC Heading" w:uiPriority="39" w:qFormat="1"/>
   </w:latentStyles>
   <w:style w:type="paragraph" w:default="1" w:styleId="Normal">
     <w:name w:val="Normal"/>
@@ -4171,6 +4133,7 @@
     <w:uiPriority w:val="99"/>
     <w:semiHidden/>
     <w:unhideWhenUsed/>
+    <w:qFormat/>
     <w:tblPr>
       <w:tblInd w:w="0" w:type="dxa"/>
       <w:tblCellMar>
@@ -4243,7 +4206,7 @@
 </file>
 
 <file path=word/glossary/webSettings.xml><?xml version="1.0" encoding="utf-8"?>
-<w:webSettings xmlns:mc="http://schemas.openxmlformats.org/markup-compatibility/2006" xmlns:r="http://schemas.openxmlformats.org/officeDocument/2006/relationships" xmlns:w="http://schemas.openxmlformats.org/wordprocessingml/2006/main" xmlns:w14="http://schemas.microsoft.com/office/word/2010/wordml" xmlns:w15="http://schemas.microsoft.com/office/word/2012/wordml" mc:Ignorable="w14 w15">
+<w:webSettings xmlns:r="http://schemas.openxmlformats.org/officeDocument/2006/relationships" xmlns:w="http://schemas.openxmlformats.org/wordprocessingml/2006/main">
   <w:optimizeForBrowser/>
 </w:webSettings>
 </file>
@@ -4499,7 +4462,7 @@
   <a:extraClrSchemeLst/>
   <a:extLst>
     <a:ext uri="{05A4C25C-085E-4340-85A3-A5531E510DB2}">
-      <thm15:themeFamily xmlns:thm15="http://schemas.microsoft.com/office/thememl/2012/main" name="Facet" id="{C0C680CD-088A-49FC-A102-D699147F32B2}" vid="{CFBC31BA-B70F-4F30-BCAA-4F3011E16C4D}"/>
+      <thm15:themeFamily xmlns:thm15="http://schemas.microsoft.com/office/thememl/2012/main" xmlns="" name="Facet" id="{C0C680CD-088A-49FC-A102-D699147F32B2}" vid="{CFBC31BA-B70F-4F30-BCAA-4F3011E16C4D}"/>
     </a:ext>
   </a:extLst>
 </a:theme>
@@ -4510,7 +4473,7 @@
 </file>
 
 <file path=customXml/itemProps1.xml><?xml version="1.0" encoding="utf-8"?>
-<ds:datastoreItem xmlns:ds="http://schemas.openxmlformats.org/officeDocument/2006/customXml" ds:itemID="{EC04C110-34A8-4696-B4AF-E39E67FD4310}">
+<ds:datastoreItem xmlns:ds="http://schemas.openxmlformats.org/officeDocument/2006/customXml" ds:itemID="{082508D1-E5CB-4BDE-8D9A-F25BE1973B4E}">
   <ds:schemaRefs>
     <ds:schemaRef ds:uri="http://schemas.openxmlformats.org/officeDocument/2006/bibliography"/>
   </ds:schemaRefs>

</xml_diff>

<commit_message>
Updated User Guide, Exporting analytics to a file, Statistics divide by zero fix
</commit_message>
<xml_diff>
--- a/Design & Documents/User Guide.docx
+++ b/Design & Documents/User Guide.docx
@@ -480,6 +480,8 @@
               <w:tab w:val="right" w:leader="dot" w:pos="9350"/>
             </w:tabs>
           </w:pPr>
+          <w:bookmarkStart w:id="0" w:name="_GoBack"/>
+          <w:bookmarkEnd w:id="0"/>
         </w:p>
         <w:p>
           <w:pPr>
@@ -503,7 +505,7 @@
           <w:r>
             <w:fldChar w:fldCharType="separate"/>
           </w:r>
-          <w:hyperlink w:anchor="_Toc404021052" w:history="1">
+          <w:hyperlink w:anchor="_Toc405143480" w:history="1">
             <w:r>
               <w:rPr>
                 <w:rStyle w:val="Hyperlink"/>
@@ -530,7 +532,7 @@
                 <w:noProof/>
                 <w:webHidden/>
               </w:rPr>
-              <w:instrText xml:space="preserve"> PAGEREF _Toc404021052 \h </w:instrText>
+              <w:instrText xml:space="preserve"> PAGEREF _Toc405143480 \h </w:instrText>
             </w:r>
             <w:r>
               <w:rPr>
@@ -574,7 +576,7 @@
               <w:lang w:eastAsia="en-CA"/>
             </w:rPr>
           </w:pPr>
-          <w:hyperlink w:anchor="_Toc404021053" w:history="1">
+          <w:hyperlink w:anchor="_Toc405143481" w:history="1">
             <w:r>
               <w:rPr>
                 <w:rStyle w:val="Hyperlink"/>
@@ -601,7 +603,7 @@
                 <w:noProof/>
                 <w:webHidden/>
               </w:rPr>
-              <w:instrText xml:space="preserve"> PAGEREF _Toc404021053 \h </w:instrText>
+              <w:instrText xml:space="preserve"> PAGEREF _Toc405143481 \h </w:instrText>
             </w:r>
             <w:r>
               <w:rPr>
@@ -645,7 +647,7 @@
               <w:lang w:eastAsia="en-CA"/>
             </w:rPr>
           </w:pPr>
-          <w:hyperlink w:anchor="_Toc404021054" w:history="1">
+          <w:hyperlink w:anchor="_Toc405143482" w:history="1">
             <w:r>
               <w:rPr>
                 <w:rStyle w:val="Hyperlink"/>
@@ -672,7 +674,7 @@
                 <w:noProof/>
                 <w:webHidden/>
               </w:rPr>
-              <w:instrText xml:space="preserve"> PAGEREF _Toc404021054 \h </w:instrText>
+              <w:instrText xml:space="preserve"> PAGEREF _Toc405143482 \h </w:instrText>
             </w:r>
             <w:r>
               <w:rPr>
@@ -716,7 +718,7 @@
               <w:lang w:eastAsia="en-CA"/>
             </w:rPr>
           </w:pPr>
-          <w:hyperlink w:anchor="_Toc404021055" w:history="1">
+          <w:hyperlink w:anchor="_Toc405143483" w:history="1">
             <w:r>
               <w:rPr>
                 <w:rStyle w:val="Hyperlink"/>
@@ -743,7 +745,7 @@
                 <w:noProof/>
                 <w:webHidden/>
               </w:rPr>
-              <w:instrText xml:space="preserve"> PAGEREF _Toc404021055 \h </w:instrText>
+              <w:instrText xml:space="preserve"> PAGEREF _Toc405143483 \h </w:instrText>
             </w:r>
             <w:r>
               <w:rPr>
@@ -787,7 +789,7 @@
               <w:lang w:eastAsia="en-CA"/>
             </w:rPr>
           </w:pPr>
-          <w:hyperlink w:anchor="_Toc404021056" w:history="1">
+          <w:hyperlink w:anchor="_Toc405143484" w:history="1">
             <w:r>
               <w:rPr>
                 <w:rStyle w:val="Hyperlink"/>
@@ -814,7 +816,7 @@
                 <w:noProof/>
                 <w:webHidden/>
               </w:rPr>
-              <w:instrText xml:space="preserve"> PAGEREF _Toc404021056 \h </w:instrText>
+              <w:instrText xml:space="preserve"> PAGEREF _Toc405143484 \h </w:instrText>
             </w:r>
             <w:r>
               <w:rPr>
@@ -858,7 +860,7 @@
               <w:lang w:eastAsia="en-CA"/>
             </w:rPr>
           </w:pPr>
-          <w:hyperlink w:anchor="_Toc404021057" w:history="1">
+          <w:hyperlink w:anchor="_Toc405143485" w:history="1">
             <w:r>
               <w:rPr>
                 <w:rStyle w:val="Hyperlink"/>
@@ -885,7 +887,7 @@
                 <w:noProof/>
                 <w:webHidden/>
               </w:rPr>
-              <w:instrText xml:space="preserve"> PAGEREF _Toc404021057 \h </w:instrText>
+              <w:instrText xml:space="preserve"> PAGEREF _Toc405143485 \h </w:instrText>
             </w:r>
             <w:r>
               <w:rPr>
@@ -929,7 +931,7 @@
               <w:lang w:eastAsia="en-CA"/>
             </w:rPr>
           </w:pPr>
-          <w:hyperlink w:anchor="_Toc404021058" w:history="1">
+          <w:hyperlink w:anchor="_Toc405143486" w:history="1">
             <w:r>
               <w:rPr>
                 <w:rStyle w:val="Hyperlink"/>
@@ -956,7 +958,78 @@
                 <w:noProof/>
                 <w:webHidden/>
               </w:rPr>
-              <w:instrText xml:space="preserve"> PAGEREF _Toc404021058 \h </w:instrText>
+              <w:instrText xml:space="preserve"> PAGEREF _Toc405143486 \h </w:instrText>
+            </w:r>
+            <w:r>
+              <w:rPr>
+                <w:noProof/>
+                <w:webHidden/>
+              </w:rPr>
+            </w:r>
+            <w:r>
+              <w:rPr>
+                <w:noProof/>
+                <w:webHidden/>
+              </w:rPr>
+              <w:fldChar w:fldCharType="separate"/>
+            </w:r>
+            <w:r>
+              <w:rPr>
+                <w:noProof/>
+                <w:webHidden/>
+              </w:rPr>
+              <w:t>4</w:t>
+            </w:r>
+            <w:r>
+              <w:rPr>
+                <w:noProof/>
+                <w:webHidden/>
+              </w:rPr>
+              <w:fldChar w:fldCharType="end"/>
+            </w:r>
+          </w:hyperlink>
+        </w:p>
+        <w:p>
+          <w:pPr>
+            <w:pStyle w:val="TOC2"/>
+            <w:tabs>
+              <w:tab w:val="right" w:leader="dot" w:pos="9350"/>
+            </w:tabs>
+            <w:rPr>
+              <w:noProof/>
+              <w:sz w:val="22"/>
+              <w:szCs w:val="22"/>
+              <w:lang w:eastAsia="en-CA"/>
+            </w:rPr>
+          </w:pPr>
+          <w:hyperlink w:anchor="_Toc405143487" w:history="1">
+            <w:r>
+              <w:rPr>
+                <w:rStyle w:val="Hyperlink"/>
+                <w:noProof/>
+              </w:rPr>
+              <w:t>Exporting Analytics</w:t>
+            </w:r>
+            <w:r>
+              <w:rPr>
+                <w:noProof/>
+                <w:webHidden/>
+              </w:rPr>
+              <w:tab/>
+            </w:r>
+            <w:r>
+              <w:rPr>
+                <w:noProof/>
+                <w:webHidden/>
+              </w:rPr>
+              <w:fldChar w:fldCharType="begin"/>
+            </w:r>
+            <w:r>
+              <w:rPr>
+                <w:noProof/>
+                <w:webHidden/>
+              </w:rPr>
+              <w:instrText xml:space="preserve"> PAGEREF _Toc405143487 \h </w:instrText>
             </w:r>
             <w:r>
               <w:rPr>
@@ -1000,7 +1073,7 @@
               <w:lang w:eastAsia="en-CA"/>
             </w:rPr>
           </w:pPr>
-          <w:hyperlink w:anchor="_Toc404021059" w:history="1">
+          <w:hyperlink w:anchor="_Toc405143488" w:history="1">
             <w:r>
               <w:rPr>
                 <w:rStyle w:val="Hyperlink"/>
@@ -1027,7 +1100,7 @@
                 <w:noProof/>
                 <w:webHidden/>
               </w:rPr>
-              <w:instrText xml:space="preserve"> PAGEREF _Toc404021059 \h </w:instrText>
+              <w:instrText xml:space="preserve"> PAGEREF _Toc405143488 \h </w:instrText>
             </w:r>
             <w:r>
               <w:rPr>
@@ -1071,13 +1144,13 @@
               <w:lang w:eastAsia="en-CA"/>
             </w:rPr>
           </w:pPr>
-          <w:hyperlink w:anchor="_Toc404021060" w:history="1">
+          <w:hyperlink w:anchor="_Toc405143489" w:history="1">
             <w:r>
               <w:rPr>
                 <w:rStyle w:val="Hyperlink"/>
                 <w:noProof/>
               </w:rPr>
-              <w:t>Modem cannot be found by program</w:t>
+              <w:t>The Modem cannot be found by program</w:t>
             </w:r>
             <w:r>
               <w:rPr>
@@ -1098,7 +1171,7 @@
                 <w:noProof/>
                 <w:webHidden/>
               </w:rPr>
-              <w:instrText xml:space="preserve"> PAGEREF _Toc404021060 \h </w:instrText>
+              <w:instrText xml:space="preserve"> PAGEREF _Toc405143489 \h </w:instrText>
             </w:r>
             <w:r>
               <w:rPr>
@@ -1137,9 +1210,12 @@
             </w:tabs>
             <w:rPr>
               <w:noProof/>
+              <w:sz w:val="22"/>
+              <w:szCs w:val="22"/>
+              <w:lang w:eastAsia="en-CA"/>
             </w:rPr>
           </w:pPr>
-          <w:hyperlink w:anchor="_Toc404021061" w:history="1">
+          <w:hyperlink w:anchor="_Toc405143490" w:history="1">
             <w:r>
               <w:rPr>
                 <w:rStyle w:val="Hyperlink"/>
@@ -1166,7 +1242,7 @@
                 <w:noProof/>
                 <w:webHidden/>
               </w:rPr>
-              <w:instrText xml:space="preserve"> PAGEREF _Toc404021061 \h </w:instrText>
+              <w:instrText xml:space="preserve"> PAGEREF _Toc405143490 \h </w:instrText>
             </w:r>
             <w:r>
               <w:rPr>
@@ -1187,6 +1263,77 @@
                 <w:webHidden/>
               </w:rPr>
               <w:t>4</w:t>
+            </w:r>
+            <w:r>
+              <w:rPr>
+                <w:noProof/>
+                <w:webHidden/>
+              </w:rPr>
+              <w:fldChar w:fldCharType="end"/>
+            </w:r>
+          </w:hyperlink>
+        </w:p>
+        <w:p>
+          <w:pPr>
+            <w:pStyle w:val="TOC3"/>
+            <w:tabs>
+              <w:tab w:val="right" w:leader="dot" w:pos="9350"/>
+            </w:tabs>
+            <w:rPr>
+              <w:noProof/>
+              <w:sz w:val="22"/>
+              <w:szCs w:val="22"/>
+              <w:lang w:eastAsia="en-CA"/>
+            </w:rPr>
+          </w:pPr>
+          <w:hyperlink w:anchor="_Toc405143491" w:history="1">
+            <w:r>
+              <w:rPr>
+                <w:rStyle w:val="Hyperlink"/>
+                <w:noProof/>
+              </w:rPr>
+              <w:t>Connect your Modem to another Port</w:t>
+            </w:r>
+            <w:r>
+              <w:rPr>
+                <w:noProof/>
+                <w:webHidden/>
+              </w:rPr>
+              <w:tab/>
+            </w:r>
+            <w:r>
+              <w:rPr>
+                <w:noProof/>
+                <w:webHidden/>
+              </w:rPr>
+              <w:fldChar w:fldCharType="begin"/>
+            </w:r>
+            <w:r>
+              <w:rPr>
+                <w:noProof/>
+                <w:webHidden/>
+              </w:rPr>
+              <w:instrText xml:space="preserve"> PAGEREF _Toc405143491 \h </w:instrText>
+            </w:r>
+            <w:r>
+              <w:rPr>
+                <w:noProof/>
+                <w:webHidden/>
+              </w:rPr>
+            </w:r>
+            <w:r>
+              <w:rPr>
+                <w:noProof/>
+                <w:webHidden/>
+              </w:rPr>
+              <w:fldChar w:fldCharType="separate"/>
+            </w:r>
+            <w:r>
+              <w:rPr>
+                <w:noProof/>
+                <w:webHidden/>
+              </w:rPr>
+              <w:t>5</w:t>
             </w:r>
             <w:r>
               <w:rPr>
@@ -1210,7 +1357,7 @@
               <w:lang w:eastAsia="en-CA"/>
             </w:rPr>
           </w:pPr>
-          <w:hyperlink w:anchor="_Toc404021062" w:history="1">
+          <w:hyperlink w:anchor="_Toc405143492" w:history="1">
             <w:r>
               <w:rPr>
                 <w:rStyle w:val="Hyperlink"/>
@@ -1237,7 +1384,7 @@
                 <w:noProof/>
                 <w:webHidden/>
               </w:rPr>
-              <w:instrText xml:space="preserve"> PAGEREF _Toc404021062 \h </w:instrText>
+              <w:instrText xml:space="preserve"> PAGEREF _Toc405143492 \h </w:instrText>
             </w:r>
             <w:r>
               <w:rPr>
@@ -1257,7 +1404,7 @@
                 <w:noProof/>
                 <w:webHidden/>
               </w:rPr>
-              <w:t>4</w:t>
+              <w:t>5</w:t>
             </w:r>
             <w:r>
               <w:rPr>
@@ -1276,9 +1423,12 @@
             </w:tabs>
             <w:rPr>
               <w:noProof/>
+              <w:sz w:val="22"/>
+              <w:szCs w:val="22"/>
+              <w:lang w:eastAsia="en-CA"/>
             </w:rPr>
           </w:pPr>
-          <w:hyperlink w:anchor="_Toc404021063" w:history="1">
+          <w:hyperlink w:anchor="_Toc405143493" w:history="1">
             <w:r>
               <w:rPr>
                 <w:rStyle w:val="Hyperlink"/>
@@ -1305,7 +1455,7 @@
                 <w:noProof/>
                 <w:webHidden/>
               </w:rPr>
-              <w:instrText xml:space="preserve"> PAGEREF _Toc404021063 \h </w:instrText>
+              <w:instrText xml:space="preserve"> PAGEREF _Toc405143493 \h </w:instrText>
             </w:r>
             <w:r>
               <w:rPr>
@@ -1325,7 +1475,7 @@
                 <w:noProof/>
                 <w:webHidden/>
               </w:rPr>
-              <w:t>4</w:t>
+              <w:t>5</w:t>
             </w:r>
             <w:r>
               <w:rPr>
@@ -1372,12 +1522,12 @@
         <w:pStyle w:val="Heading1"/>
         <w:jc w:val="center"/>
       </w:pPr>
-      <w:bookmarkStart w:id="0" w:name="_Toc404021052"/>
+      <w:bookmarkStart w:id="1" w:name="_Toc405143480"/>
       <w:r>
         <w:lastRenderedPageBreak/>
         <w:t>Introduction</w:t>
       </w:r>
-      <w:bookmarkEnd w:id="0"/>
+      <w:bookmarkEnd w:id="1"/>
     </w:p>
     <w:p/>
     <w:p>
@@ -1426,12 +1576,19 @@
         <w:t>contains functionality for</w:t>
       </w:r>
       <w:r>
-        <w:t xml:space="preserve"> transmitting single characters and full text files across </w:t>
-      </w:r>
-      <w:bookmarkStart w:id="1" w:name="_GoBack"/>
-      <w:bookmarkEnd w:id="1"/>
-      <w:r>
-        <w:t>wired and wireless environments, and is capable of tracking protocol statistics for debugging and analytical purposes.</w:t>
+        <w:t xml:space="preserve"> </w:t>
+      </w:r>
+      <w:r>
+        <w:t>transmitting typed messages</w:t>
+      </w:r>
+      <w:r>
+        <w:t xml:space="preserve"> and full text files across wired and wireless environments, and is capable of tracking</w:t>
+      </w:r>
+      <w:r>
+        <w:t xml:space="preserve"> and exporting</w:t>
+      </w:r>
+      <w:r>
+        <w:t xml:space="preserve"> protocol statistics for debugging and analytical purposes.</w:t>
       </w:r>
       <w:r>
         <w:t xml:space="preserve"> </w:t>
@@ -1443,7 +1600,7 @@
         <w:pStyle w:val="Heading1"/>
         <w:jc w:val="center"/>
       </w:pPr>
-      <w:bookmarkStart w:id="2" w:name="_Toc404021053"/>
+      <w:bookmarkStart w:id="2" w:name="_Toc405143481"/>
       <w:r>
         <w:t>Setting Up</w:t>
       </w:r>
@@ -1454,7 +1611,7 @@
       <w:pPr>
         <w:pStyle w:val="Heading2"/>
       </w:pPr>
-      <w:bookmarkStart w:id="3" w:name="_Toc404021054"/>
+      <w:bookmarkStart w:id="3" w:name="_Toc405143482"/>
       <w:r>
         <w:t>Connecting the Modem</w:t>
       </w:r>
@@ -1534,7 +1691,7 @@
       <w:pPr>
         <w:pStyle w:val="Heading2"/>
       </w:pPr>
-      <w:bookmarkStart w:id="4" w:name="_Toc404021055"/>
+      <w:bookmarkStart w:id="4" w:name="_Toc405143483"/>
       <w:r>
         <w:t>Launching the Program</w:t>
       </w:r>
@@ -1570,7 +1727,7 @@
         <w:pStyle w:val="Heading1"/>
         <w:jc w:val="center"/>
       </w:pPr>
-      <w:bookmarkStart w:id="5" w:name="_Toc404021056"/>
+      <w:bookmarkStart w:id="5" w:name="_Toc405143484"/>
       <w:r>
         <w:t>Features</w:t>
       </w:r>
@@ -1581,7 +1738,7 @@
       <w:pPr>
         <w:pStyle w:val="Heading2"/>
       </w:pPr>
-      <w:bookmarkStart w:id="6" w:name="_Toc404021057"/>
+      <w:bookmarkStart w:id="6" w:name="_Toc405143485"/>
       <w:r>
         <w:t>Instant Messaging</w:t>
       </w:r>
@@ -1596,19 +1753,50 @@
         <w:t>Irregardless</w:t>
       </w:r>
       <w:r>
-        <w:t xml:space="preserve"> allows you to send messages character-by-character as you type. In order to access this functionality, run </w:t>
+        <w:t xml:space="preserve"> allows you to send</w:t>
+      </w:r>
+      <w:r>
+        <w:t xml:space="preserve"> individual messages, not unlike an instant messenger client</w:t>
+      </w:r>
+      <w:r>
+        <w:t xml:space="preserve">. In order to access this functionality, run </w:t>
       </w:r>
       <w:r>
         <w:t>the program</w:t>
       </w:r>
       <w:r>
-        <w:t xml:space="preserve"> and start typing to the keyboard. Your text will be sent to the receiving user as you are typing.</w:t>
+        <w:t xml:space="preserve">, select the text box, and start typing. Once you </w:t>
+      </w:r>
+      <w:r>
+        <w:lastRenderedPageBreak/>
+        <w:t>are done typing your message, press enter or click the send button</w:t>
+      </w:r>
+      <w:r>
+        <w:t xml:space="preserve">. Your text will </w:t>
+      </w:r>
+      <w:r>
+        <w:t>be sent to the receiving user</w:t>
+      </w:r>
+      <w:r>
+        <w:t>.</w:t>
       </w:r>
     </w:p>
     <w:p/>
     <w:p>
       <w:r>
-        <w:t>In addition, you will receive text character-by-character from the connected user as they are typing. This text will display on your screen as it arrives.</w:t>
+        <w:t xml:space="preserve">In addition, you will receive text </w:t>
+      </w:r>
+      <w:r>
+        <w:t>messages</w:t>
+      </w:r>
+      <w:r>
+        <w:t xml:space="preserve"> from the connected user as they </w:t>
+      </w:r>
+      <w:r>
+        <w:t>send them</w:t>
+      </w:r>
+      <w:r>
+        <w:t>. This text will display on your screen as it arrives.</w:t>
       </w:r>
     </w:p>
     <w:p/>
@@ -1616,7 +1804,7 @@
       <w:pPr>
         <w:pStyle w:val="Heading2"/>
       </w:pPr>
-      <w:bookmarkStart w:id="7" w:name="_Toc404021058"/>
+      <w:bookmarkStart w:id="7" w:name="_Toc405143486"/>
       <w:r>
         <w:t>Sending Text Files</w:t>
       </w:r>
@@ -1649,28 +1837,54 @@
     <w:p/>
     <w:p>
       <w:pPr>
-        <w:pStyle w:val="Heading1"/>
-        <w:jc w:val="center"/>
-      </w:pPr>
-      <w:bookmarkStart w:id="8" w:name="_Toc404021059"/>
-      <w:r>
-        <w:t>Troubleshooting</w:t>
+        <w:pStyle w:val="Heading2"/>
+      </w:pPr>
+      <w:bookmarkStart w:id="8" w:name="_Toc405143487"/>
+      <w:r>
+        <w:t>Exporting Analytics</w:t>
       </w:r>
       <w:bookmarkEnd w:id="8"/>
     </w:p>
     <w:p/>
     <w:p>
-      <w:pPr>
-        <w:pStyle w:val="Heading2"/>
-      </w:pPr>
-      <w:bookmarkStart w:id="9" w:name="_Toc404021060"/>
-      <w:r>
-        <w:t>Modem cannot be found by program</w:t>
+      <w:r>
+        <w:rPr>
+          <w:i/>
+        </w:rPr>
+        <w:t>Irregardless</w:t>
+      </w:r>
+      <w:r>
+        <w:t xml:space="preserve"> displays your primary analytics in the top-right corner of the screen. If you want to export your analytics to a file, click on Export &gt; Export Analytics. A file called “Protocol Analytics.txt” will be created in your application directory. </w:t>
+      </w:r>
+    </w:p>
+    <w:p/>
+    <w:p>
+      <w:pPr>
+        <w:pStyle w:val="Heading1"/>
+        <w:jc w:val="center"/>
+      </w:pPr>
+      <w:bookmarkStart w:id="9" w:name="_Toc405143488"/>
+      <w:r>
+        <w:t>Troubleshooting</w:t>
       </w:r>
       <w:bookmarkEnd w:id="9"/>
     </w:p>
     <w:p/>
     <w:p>
+      <w:pPr>
+        <w:pStyle w:val="Heading2"/>
+      </w:pPr>
+      <w:bookmarkStart w:id="10" w:name="_Toc405143489"/>
+      <w:r>
+        <w:t xml:space="preserve">The </w:t>
+      </w:r>
+      <w:r>
+        <w:t>Modem cannot be found by program</w:t>
+      </w:r>
+      <w:bookmarkEnd w:id="10"/>
+    </w:p>
+    <w:p/>
+    <w:p>
       <w:r>
         <w:t xml:space="preserve">If </w:t>
       </w:r>
@@ -1689,33 +1903,16 @@
       <w:pPr>
         <w:pStyle w:val="Heading3"/>
       </w:pPr>
-      <w:bookmarkStart w:id="10" w:name="_Toc404021061"/>
+      <w:bookmarkStart w:id="11" w:name="_Toc405143490"/>
       <w:r>
         <w:t>Disconnect and Reconnect your Modem</w:t>
-      </w:r>
-      <w:bookmarkEnd w:id="10"/>
-    </w:p>
-    <w:p/>
-    <w:p>
-      <w:r>
-        <w:t>It is possible that your modem was not connected properly, or that the connection has become loose since you initially connected it. Try disconnecting it completely and then re-connecting it, ensuring that the screws on either side are also connected.</w:t>
-      </w:r>
-    </w:p>
-    <w:p/>
-    <w:p>
-      <w:pPr>
-        <w:pStyle w:val="Heading2"/>
-      </w:pPr>
-      <w:bookmarkStart w:id="11" w:name="_Toc404021062"/>
-      <w:r>
-        <w:t>Jumbled characters are appearing on the screen</w:t>
       </w:r>
       <w:bookmarkEnd w:id="11"/>
     </w:p>
     <w:p/>
     <w:p>
       <w:r>
-        <w:t>If you are receiving strange, unpredicted characters, try the following solutions:</w:t>
+        <w:t>It is possible that your modem was not connected properly, or that the connection has become loose since you initially connected it. Try disconnecting it completely and then re-connecting it, ensuring that the screws on either side are also connected.</w:t>
       </w:r>
     </w:p>
     <w:p/>
@@ -1723,11 +1920,64 @@
       <w:pPr>
         <w:pStyle w:val="Heading3"/>
       </w:pPr>
-      <w:bookmarkStart w:id="12" w:name="_Toc404021063"/>
+      <w:bookmarkStart w:id="12" w:name="_Toc405143491"/>
+      <w:r>
+        <w:lastRenderedPageBreak/>
+        <w:t>Connect your Modem to another Port</w:t>
+      </w:r>
+      <w:bookmarkEnd w:id="12"/>
+    </w:p>
+    <w:p/>
+    <w:p>
+      <w:r>
+        <w:t xml:space="preserve">If you are connecting your modem using a serial-to-USB adapter, or if your computer has multiple serial ports, try connecting your modem to a different port. </w:t>
+      </w:r>
+      <w:r>
+        <w:rPr>
+          <w:i/>
+        </w:rPr>
+        <w:t>Irregardless</w:t>
+      </w:r>
+      <w:r>
+        <w:t xml:space="preserve"> operates using the</w:t>
+      </w:r>
+      <w:r>
+        <w:rPr>
+          <w:b/>
+        </w:rPr>
+        <w:t xml:space="preserve"> COM1</w:t>
+      </w:r>
+      <w:r>
+        <w:t xml:space="preserve"> serial port.</w:t>
+      </w:r>
+    </w:p>
+    <w:p/>
+    <w:p>
+      <w:pPr>
+        <w:pStyle w:val="Heading2"/>
+      </w:pPr>
+      <w:bookmarkStart w:id="13" w:name="_Toc405143492"/>
+      <w:r>
+        <w:t>Jumbled characters are appearing on the screen</w:t>
+      </w:r>
+      <w:bookmarkEnd w:id="13"/>
+    </w:p>
+    <w:p/>
+    <w:p>
+      <w:r>
+        <w:t>If you are receiving strange, unpredicted characters, try the following solutions:</w:t>
+      </w:r>
+    </w:p>
+    <w:p/>
+    <w:p>
+      <w:pPr>
+        <w:pStyle w:val="Heading3"/>
+      </w:pPr>
+      <w:bookmarkStart w:id="14" w:name="_Toc405143493"/>
       <w:r>
         <w:t>Relocate to a Different Area</w:t>
       </w:r>
-      <w:bookmarkEnd w:id="12"/>
+      <w:bookmarkEnd w:id="14"/>
     </w:p>
     <w:p/>
     <w:p>
@@ -4246,6 +4496,7 @@
     <w:rsid w:val="006D4F45"/>
     <w:rsid w:val="007A6147"/>
     <w:rsid w:val="007C57FB"/>
+    <w:rsid w:val="008D1E2D"/>
     <w:rsid w:val="00B41314"/>
     <w:rsid w:val="00BB23FA"/>
     <w:rsid w:val="00CA6D4F"/>
@@ -5016,7 +5267,7 @@
 </file>
 
 <file path=customXml/itemProps1.xml><?xml version="1.0" encoding="utf-8"?>
-<ds:datastoreItem xmlns:ds="http://schemas.openxmlformats.org/officeDocument/2006/customXml" ds:itemID="{87EF6E76-8DC6-41E4-B1C2-0ADBCCB2D629}">
+<ds:datastoreItem xmlns:ds="http://schemas.openxmlformats.org/officeDocument/2006/customXml" ds:itemID="{C40DD529-AADC-440C-A6EB-290A93B830B4}">
   <ds:schemaRefs>
     <ds:schemaRef ds:uri="http://schemas.openxmlformats.org/officeDocument/2006/bibliography"/>
   </ds:schemaRefs>

</xml_diff>